<commit_message>
update footer, add legalcontroller and templates rgpd,legal mention and page contact bounded with mailpit
</commit_message>
<xml_diff>
--- a/documentation/dossier minifacturier.docx
+++ b/documentation/dossier minifacturier.docx
@@ -2855,23 +2855,7 @@
           <w:sz w:val="32"/>
           <w:szCs w:val="32"/>
         </w:rPr>
-        <w:t>e développement de l’application a été effectué avec l’éditeur de code Visual Studio Code, offrant des fonctionnalités telles que la coloration syntaxique, l’</w:t>
-      </w:r>
-      <w:proofErr w:type="spellStart"/>
-      <w:r>
-        <w:rPr>
-          <w:sz w:val="32"/>
-          <w:szCs w:val="32"/>
-        </w:rPr>
-        <w:t>auto-complétion</w:t>
-      </w:r>
-      <w:proofErr w:type="spellEnd"/>
-      <w:r>
-        <w:rPr>
-          <w:sz w:val="32"/>
-          <w:szCs w:val="32"/>
-        </w:rPr>
-        <w:t xml:space="preserve"> et la gestion des extensions, facilitant ainsi la productivité et la lisibilité du code.</w:t>
+        <w:t>e développement de l’application a été effectué avec l’éditeur de code Visual Studio Code, offrant des fonctionnalités telles que la coloration syntaxique, l’auto-complétion et la gestion des extensions, facilitant ainsi la productivité et la lisibilité du code.</w:t>
       </w:r>
     </w:p>
     <w:p>
@@ -2896,23 +2880,7 @@
           <w:sz w:val="32"/>
           <w:szCs w:val="32"/>
         </w:rPr>
-        <w:t xml:space="preserve">a base de données est gérée avec MySQL, et son administration est assurée par l’outil </w:t>
-      </w:r>
-      <w:proofErr w:type="spellStart"/>
-      <w:r>
-        <w:rPr>
-          <w:sz w:val="32"/>
-          <w:szCs w:val="32"/>
-        </w:rPr>
-        <w:t>HeidiSQL</w:t>
-      </w:r>
-      <w:proofErr w:type="spellEnd"/>
-      <w:r>
-        <w:rPr>
-          <w:sz w:val="32"/>
-          <w:szCs w:val="32"/>
-        </w:rPr>
-        <w:t>, intégré à l’environnement Laragon.</w:t>
+        <w:t>a base de données est gérée avec MySQL, et son administration est assurée par l’outil HeidiSQL, intégré à l’environnement Laragon.</w:t>
       </w:r>
     </w:p>
     <w:p>
@@ -2942,13 +2910,31 @@
     </w:p>
     <w:p>
       <w:pPr>
-        <w:rPr>
-          <w:b/>
-          <w:bCs/>
-          <w:sz w:val="32"/>
-          <w:szCs w:val="32"/>
-        </w:rPr>
-      </w:pPr>
+        <w:ind w:firstLine="567"/>
+        <w:rPr>
+          <w:sz w:val="32"/>
+          <w:szCs w:val="32"/>
+        </w:rPr>
+      </w:pPr>
+    </w:p>
+    <w:p>
+      <w:pPr>
+        <w:rPr>
+          <w:b/>
+          <w:bCs/>
+          <w:sz w:val="32"/>
+          <w:szCs w:val="32"/>
+        </w:rPr>
+      </w:pPr>
+      <w:r>
+        <w:rPr>
+          <w:b/>
+          <w:bCs/>
+          <w:sz w:val="32"/>
+          <w:szCs w:val="32"/>
+        </w:rPr>
+        <w:t>Docker, WSL</w:t>
+      </w:r>
     </w:p>
     <w:p>
       <w:pPr>
@@ -3091,7 +3077,6 @@
         </w:rPr>
         <w:t xml:space="preserve">e </w:t>
       </w:r>
-      <w:proofErr w:type="spellStart"/>
       <w:r>
         <w:rPr>
           <w:b/>
@@ -3101,7 +3086,6 @@
         </w:rPr>
         <w:t>framework</w:t>
       </w:r>
-      <w:proofErr w:type="spellEnd"/>
       <w:r>
         <w:rPr>
           <w:sz w:val="32"/>
@@ -3148,14 +3132,7 @@
           <w:sz w:val="32"/>
           <w:szCs w:val="32"/>
         </w:rPr>
-        <w:t xml:space="preserve">e moteur de </w:t>
-      </w:r>
-      <w:r>
-        <w:rPr>
-          <w:sz w:val="32"/>
-          <w:szCs w:val="32"/>
-        </w:rPr>
-        <w:t>Templates</w:t>
+        <w:t>e moteur de Templates</w:t>
       </w:r>
       <w:r>
         <w:rPr>
@@ -3346,16 +3323,7 @@
           <w:sz w:val="32"/>
           <w:szCs w:val="32"/>
         </w:rPr>
-        <w:t>Templates</w:t>
-      </w:r>
-      <w:r>
-        <w:rPr>
-          <w:b/>
-          <w:bCs/>
-          <w:sz w:val="32"/>
-          <w:szCs w:val="32"/>
-        </w:rPr>
-        <w:t xml:space="preserve"> HTML</w:t>
+        <w:t>Templates HTML</w:t>
       </w:r>
       <w:r>
         <w:rPr>
@@ -3579,19 +3547,8 @@
           <w:szCs w:val="32"/>
         </w:rPr>
         <w:lastRenderedPageBreak/>
-        <w:t xml:space="preserve">Le workflow de l’application </w:t>
-      </w:r>
-      <w:proofErr w:type="spellStart"/>
-      <w:r>
-        <w:rPr>
-          <w:b/>
-          <w:bCs/>
-          <w:sz w:val="32"/>
-          <w:szCs w:val="32"/>
-        </w:rPr>
-        <w:t>Mini-Facturier</w:t>
-      </w:r>
-      <w:proofErr w:type="spellEnd"/>
+        <w:t>Le workflow de l’application Mini-Facturier</w:t>
+      </w:r>
     </w:p>
     <w:p>
       <w:pPr>
@@ -4061,86 +4018,6 @@
     <w:p>
       <w:pPr>
         <w:rPr>
-          <w:sz w:val="32"/>
-          <w:szCs w:val="32"/>
-        </w:rPr>
-      </w:pPr>
-    </w:p>
-    <w:p>
-      <w:pPr>
-        <w:rPr>
-          <w:sz w:val="32"/>
-          <w:szCs w:val="32"/>
-        </w:rPr>
-      </w:pPr>
-    </w:p>
-    <w:p>
-      <w:pPr>
-        <w:rPr>
-          <w:sz w:val="32"/>
-          <w:szCs w:val="32"/>
-        </w:rPr>
-      </w:pPr>
-    </w:p>
-    <w:p>
-      <w:pPr>
-        <w:rPr>
-          <w:sz w:val="32"/>
-          <w:szCs w:val="32"/>
-        </w:rPr>
-      </w:pPr>
-    </w:p>
-    <w:p>
-      <w:pPr>
-        <w:rPr>
-          <w:sz w:val="32"/>
-          <w:szCs w:val="32"/>
-        </w:rPr>
-      </w:pPr>
-    </w:p>
-    <w:p>
-      <w:pPr>
-        <w:rPr>
-          <w:sz w:val="32"/>
-          <w:szCs w:val="32"/>
-        </w:rPr>
-      </w:pPr>
-    </w:p>
-    <w:p>
-      <w:pPr>
-        <w:rPr>
-          <w:sz w:val="32"/>
-          <w:szCs w:val="32"/>
-        </w:rPr>
-      </w:pPr>
-    </w:p>
-    <w:p>
-      <w:pPr>
-        <w:rPr>
-          <w:sz w:val="32"/>
-          <w:szCs w:val="32"/>
-        </w:rPr>
-      </w:pPr>
-    </w:p>
-    <w:p>
-      <w:pPr>
-        <w:rPr>
-          <w:sz w:val="32"/>
-          <w:szCs w:val="32"/>
-        </w:rPr>
-      </w:pPr>
-    </w:p>
-    <w:p>
-      <w:pPr>
-        <w:rPr>
-          <w:sz w:val="32"/>
-          <w:szCs w:val="32"/>
-        </w:rPr>
-      </w:pPr>
-    </w:p>
-    <w:p>
-      <w:pPr>
-        <w:rPr>
           <w:b/>
           <w:bCs/>
           <w:sz w:val="32"/>
@@ -4360,10 +4237,81 @@
       </w:pPr>
       <w:bookmarkStart w:id="6" w:name="_Toc227941622"/>
       <w:r>
+        <w:t>Modèle Physique de Données (MPD)</w:t>
+      </w:r>
+      <w:bookmarkEnd w:id="6"/>
+    </w:p>
+    <w:p>
+      <w:pPr>
+        <w:ind w:firstLine="567"/>
+        <w:rPr>
+          <w:sz w:val="32"/>
+          <w:szCs w:val="32"/>
+        </w:rPr>
+      </w:pPr>
+      <w:r>
+        <w:rPr>
+          <w:b/>
+          <w:bCs/>
+          <w:sz w:val="32"/>
+          <w:szCs w:val="32"/>
+        </w:rPr>
+        <w:t>L</w:t>
+      </w:r>
+      <w:r>
+        <w:rPr>
+          <w:sz w:val="32"/>
+          <w:szCs w:val="32"/>
+        </w:rPr>
+        <w:t xml:space="preserve">e MPD correspond à la traduction du MCD en tables relationnelles, directement implémentées dans la base de données </w:t>
+      </w:r>
+      <w:r>
+        <w:rPr>
+          <w:sz w:val="32"/>
+          <w:szCs w:val="32"/>
+        </w:rPr>
+        <w:t>HeidiSql</w:t>
+      </w:r>
+      <w:r>
+        <w:rPr>
+          <w:sz w:val="32"/>
+          <w:szCs w:val="32"/>
+        </w:rPr>
+        <w:t>.</w:t>
+      </w:r>
+    </w:p>
+    <w:p>
+      <w:pPr>
+        <w:ind w:firstLine="567"/>
+        <w:rPr>
+          <w:sz w:val="32"/>
+          <w:szCs w:val="32"/>
+        </w:rPr>
+      </w:pPr>
+      <w:r>
+        <w:rPr>
+          <w:b/>
+          <w:bCs/>
+          <w:sz w:val="32"/>
+          <w:szCs w:val="32"/>
+        </w:rPr>
+        <w:t>C</w:t>
+      </w:r>
+      <w:r>
+        <w:rPr>
+          <w:sz w:val="32"/>
+          <w:szCs w:val="32"/>
+        </w:rPr>
+        <w:t xml:space="preserve">haque entité du MCD a été transformée en table, avec la définition de clés primaires pour identifier de manière unique </w:t>
+      </w:r>
+      <w:r>
+        <w:rPr>
+          <w:sz w:val="32"/>
+          <w:szCs w:val="32"/>
+        </w:rPr>
         <w:lastRenderedPageBreak/>
-        <w:t>Modèle Physique de Données (MPD)</w:t>
-      </w:r>
-      <w:bookmarkEnd w:id="6"/>
+        <w:t>chaque enregistrement. Les relations entre les tables sont assurées par des clés étrangères, garantissant l’intégrité référentielle.</w:t>
+      </w:r>
     </w:p>
     <w:p>
       <w:pPr>
@@ -4380,6 +4328,31 @@
           <w:sz w:val="32"/>
           <w:szCs w:val="32"/>
         </w:rPr>
+        <w:t>D</w:t>
+      </w:r>
+      <w:r>
+        <w:rPr>
+          <w:sz w:val="32"/>
+          <w:szCs w:val="32"/>
+        </w:rPr>
+        <w:t>es contraintes ont été ajoutées afin de sécuriser les données, telles que l’unicité de certains champs (comme l’email utilisateur ou le numéro de facture), ainsi que des contraintes de non-nullité pour les données obligatoires.</w:t>
+      </w:r>
+    </w:p>
+    <w:p>
+      <w:pPr>
+        <w:ind w:firstLine="567"/>
+        <w:rPr>
+          <w:sz w:val="32"/>
+          <w:szCs w:val="32"/>
+        </w:rPr>
+      </w:pPr>
+      <w:r>
+        <w:rPr>
+          <w:b/>
+          <w:bCs/>
+          <w:sz w:val="32"/>
+          <w:szCs w:val="32"/>
+        </w:rPr>
         <w:t>L</w:t>
       </w:r>
       <w:r>
@@ -4387,21 +4360,7 @@
           <w:sz w:val="32"/>
           <w:szCs w:val="32"/>
         </w:rPr>
-        <w:t xml:space="preserve">e MPD correspond à la traduction du MCD en tables relationnelles, directement implémentées dans la base de données </w:t>
-      </w:r>
-      <w:r>
-        <w:rPr>
-          <w:sz w:val="32"/>
-          <w:szCs w:val="32"/>
-        </w:rPr>
-        <w:t>HeidiSql</w:t>
-      </w:r>
-      <w:r>
-        <w:rPr>
-          <w:sz w:val="32"/>
-          <w:szCs w:val="32"/>
-        </w:rPr>
-        <w:t>.</w:t>
+        <w:t>a table des lignes de facture joue un rôle central dans le modèle, permettant de relier les factures aux produits tout en conservant les informations au moment de la vente (nom du produit, prix, TVA), ce qui garantit la cohérence des données même en cas de modification du catalogue.</w:t>
       </w:r>
     </w:p>
     <w:p>
@@ -4426,7 +4385,7 @@
           <w:sz w:val="32"/>
           <w:szCs w:val="32"/>
         </w:rPr>
-        <w:t>haque entité du MCD a été transformée en table, avec la définition de clés primaires pour identifier de manière unique chaque enregistrement. Les relations entre les tables sont assurées par des clés étrangères, garantissant l’intégrité référentielle.</w:t>
+        <w:t>ette modélisation assure une base de données robuste, cohérente et adaptée aux besoins fonctionnels de l’application</w:t>
       </w:r>
     </w:p>
     <w:p>
@@ -4437,38 +4396,6 @@
           <w:szCs w:val="32"/>
         </w:rPr>
       </w:pPr>
-      <w:r>
-        <w:rPr>
-          <w:b/>
-          <w:bCs/>
-          <w:sz w:val="32"/>
-          <w:szCs w:val="32"/>
-        </w:rPr>
-        <w:t>D</w:t>
-      </w:r>
-      <w:r>
-        <w:rPr>
-          <w:sz w:val="32"/>
-          <w:szCs w:val="32"/>
-        </w:rPr>
-        <w:t xml:space="preserve">es contraintes ont été ajoutées afin de sécuriser les données, telles que l’unicité de certains champs (comme </w:t>
-      </w:r>
-      <w:proofErr w:type="gramStart"/>
-      <w:r>
-        <w:rPr>
-          <w:sz w:val="32"/>
-          <w:szCs w:val="32"/>
-        </w:rPr>
-        <w:t>l’email</w:t>
-      </w:r>
-      <w:proofErr w:type="gramEnd"/>
-      <w:r>
-        <w:rPr>
-          <w:sz w:val="32"/>
-          <w:szCs w:val="32"/>
-        </w:rPr>
-        <w:t xml:space="preserve"> utilisateur ou le numéro de facture), ainsi que des contraintes de non-nullité pour les données obligatoires.</w:t>
-      </w:r>
     </w:p>
     <w:p>
       <w:pPr>
@@ -4478,22 +4405,6 @@
           <w:szCs w:val="32"/>
         </w:rPr>
       </w:pPr>
-      <w:r>
-        <w:rPr>
-          <w:b/>
-          <w:bCs/>
-          <w:sz w:val="32"/>
-          <w:szCs w:val="32"/>
-        </w:rPr>
-        <w:t>L</w:t>
-      </w:r>
-      <w:r>
-        <w:rPr>
-          <w:sz w:val="32"/>
-          <w:szCs w:val="32"/>
-        </w:rPr>
-        <w:t>a table des lignes de facture joue un rôle central dans le modèle, permettant de relier les factures aux produits tout en conservant les informations au moment de la vente (nom du produit, prix, TVA), ce qui garantit la cohérence des données même en cas de modification du catalogue.</w:t>
-      </w:r>
     </w:p>
     <w:p>
       <w:pPr>
@@ -4503,22 +4414,6 @@
           <w:szCs w:val="32"/>
         </w:rPr>
       </w:pPr>
-      <w:r>
-        <w:rPr>
-          <w:b/>
-          <w:bCs/>
-          <w:sz w:val="32"/>
-          <w:szCs w:val="32"/>
-        </w:rPr>
-        <w:t>C</w:t>
-      </w:r>
-      <w:r>
-        <w:rPr>
-          <w:sz w:val="32"/>
-          <w:szCs w:val="32"/>
-        </w:rPr>
-        <w:t>ette modélisation assure une base de données robuste, cohérente et adaptée aux besoins fonctionnels de l’application</w:t>
-      </w:r>
     </w:p>
     <w:p>
       <w:pPr>
@@ -4636,20 +4531,40 @@
           <w:szCs w:val="32"/>
         </w:rPr>
       </w:pPr>
-      <w:r>
+    </w:p>
+    <w:p>
+      <w:pPr>
+        <w:ind w:firstLine="567"/>
         <w:rPr>
           <w:noProof/>
           <w:sz w:val="32"/>
           <w:szCs w:val="32"/>
         </w:rPr>
+      </w:pPr>
+    </w:p>
+    <w:p>
+      <w:pPr>
+        <w:ind w:firstLine="567"/>
+        <w:rPr>
+          <w:noProof/>
+          <w:sz w:val="32"/>
+          <w:szCs w:val="32"/>
+        </w:rPr>
+      </w:pPr>
+      <w:r>
+        <w:rPr>
+          <w:noProof/>
+          <w:sz w:val="32"/>
+          <w:szCs w:val="32"/>
+        </w:rPr>
         <w:drawing>
-          <wp:anchor distT="0" distB="0" distL="114300" distR="114300" simplePos="0" relativeHeight="251663872" behindDoc="1" locked="0" layoutInCell="1" allowOverlap="1" wp14:anchorId="29986CCE" wp14:editId="536AF52F">
+          <wp:anchor distT="0" distB="0" distL="114300" distR="114300" simplePos="0" relativeHeight="251663872" behindDoc="1" locked="0" layoutInCell="1" allowOverlap="1" wp14:anchorId="29986CCE" wp14:editId="2DED8F9B">
             <wp:simplePos x="0" y="0"/>
             <wp:positionH relativeFrom="margin">
-              <wp:align>left</wp:align>
+              <wp:posOffset>-1543050</wp:posOffset>
             </wp:positionH>
             <wp:positionV relativeFrom="paragraph">
-              <wp:posOffset>235480</wp:posOffset>
+              <wp:posOffset>470806</wp:posOffset>
             </wp:positionV>
             <wp:extent cx="9069496" cy="6276854"/>
             <wp:effectExtent l="5715" t="0" r="4445" b="4445"/>
@@ -4710,6 +4625,7 @@
       <w:pPr>
         <w:ind w:firstLine="567"/>
         <w:rPr>
+          <w:noProof/>
           <w:sz w:val="32"/>
           <w:szCs w:val="32"/>
         </w:rPr>
@@ -4719,15 +4635,7 @@
       <w:pPr>
         <w:ind w:firstLine="567"/>
         <w:rPr>
-          <w:sz w:val="32"/>
-          <w:szCs w:val="32"/>
-        </w:rPr>
-      </w:pPr>
-    </w:p>
-    <w:p>
-      <w:pPr>
-        <w:ind w:firstLine="567"/>
-        <w:rPr>
+          <w:noProof/>
           <w:sz w:val="32"/>
           <w:szCs w:val="32"/>
         </w:rPr>
@@ -6468,24 +6376,8 @@
                 <w:lang w:eastAsia="fr-FR"/>
                 <w14:ligatures w14:val="none"/>
               </w:rPr>
-              <w:t xml:space="preserve">seller </w:t>
-            </w:r>
-            <w:proofErr w:type="gramStart"/>
-            <w:r>
-              <w:rPr>
-                <w:rFonts w:ascii="Aptos Narrow" w:eastAsia="Times New Roman" w:hAnsi="Aptos Narrow" w:cs="Times New Roman"/>
-                <w:b/>
-                <w:bCs/>
-                <w:color w:val="000000"/>
-                <w:kern w:val="0"/>
-                <w:sz w:val="22"/>
-                <w:szCs w:val="22"/>
-                <w:lang w:eastAsia="fr-FR"/>
-                <w14:ligatures w14:val="none"/>
-              </w:rPr>
-              <w:t>datas</w:t>
-            </w:r>
-            <w:proofErr w:type="gramEnd"/>
+              <w:t>seller datas</w:t>
+            </w:r>
           </w:p>
         </w:tc>
       </w:tr>
@@ -8646,8 +8538,6 @@
                 <w14:ligatures w14:val="none"/>
               </w:rPr>
             </w:pPr>
-            <w:proofErr w:type="spellStart"/>
-            <w:proofErr w:type="gramStart"/>
             <w:r>
               <w:rPr>
                 <w:rFonts w:ascii="Aptos Narrow" w:eastAsia="Times New Roman" w:hAnsi="Aptos Narrow" w:cs="Times New Roman"/>
@@ -8660,24 +8550,8 @@
                 <w:lang w:eastAsia="fr-FR"/>
                 <w14:ligatures w14:val="none"/>
               </w:rPr>
-              <w:t>invoice</w:t>
-            </w:r>
-            <w:proofErr w:type="spellEnd"/>
-            <w:r>
-              <w:rPr>
-                <w:rFonts w:ascii="Aptos Narrow" w:eastAsia="Times New Roman" w:hAnsi="Aptos Narrow" w:cs="Times New Roman"/>
-                <w:b/>
-                <w:bCs/>
-                <w:color w:val="000000"/>
-                <w:kern w:val="0"/>
-                <w:sz w:val="22"/>
-                <w:szCs w:val="22"/>
-                <w:lang w:eastAsia="fr-FR"/>
-                <w14:ligatures w14:val="none"/>
-              </w:rPr>
-              <w:t xml:space="preserve">  Data</w:t>
-            </w:r>
-            <w:proofErr w:type="gramEnd"/>
+              <w:t>invoice  Data</w:t>
+            </w:r>
           </w:p>
         </w:tc>
       </w:tr>
@@ -9859,7 +9733,6 @@
                 <w14:ligatures w14:val="none"/>
               </w:rPr>
             </w:pPr>
-            <w:proofErr w:type="gramStart"/>
             <w:r>
               <w:rPr>
                 <w:rFonts w:ascii="Aptos Narrow" w:eastAsia="Times New Roman" w:hAnsi="Aptos Narrow" w:cs="Times New Roman"/>
@@ -9888,7 +9761,6 @@
               </w:rPr>
               <w:t xml:space="preserve">  Data</w:t>
             </w:r>
-            <w:proofErr w:type="gramEnd"/>
           </w:p>
         </w:tc>
       </w:tr>
@@ -12302,23 +12174,7 @@
           <w:sz w:val="32"/>
           <w:szCs w:val="32"/>
         </w:rPr>
-        <w:t xml:space="preserve">’authentification permet de vérifier l’identité de l’utilisateur lors de la connexion. L’utilisateur saisit son </w:t>
-      </w:r>
-      <w:proofErr w:type="gramStart"/>
-      <w:r>
-        <w:rPr>
-          <w:sz w:val="32"/>
-          <w:szCs w:val="32"/>
-        </w:rPr>
-        <w:t>email</w:t>
-      </w:r>
-      <w:proofErr w:type="gramEnd"/>
-      <w:r>
-        <w:rPr>
-          <w:sz w:val="32"/>
-          <w:szCs w:val="32"/>
-        </w:rPr>
-        <w:t xml:space="preserve"> et son mot de passe dans le formulaire </w:t>
+        <w:t xml:space="preserve">’authentification permet de vérifier l’identité de l’utilisateur lors de la connexion. L’utilisateur saisit son email et son mot de passe dans le formulaire </w:t>
       </w:r>
       <w:r>
         <w:rPr>
@@ -13018,23 +12874,7 @@
           <w:sz w:val="32"/>
           <w:szCs w:val="32"/>
         </w:rPr>
-        <w:t xml:space="preserve">a sécurisation des accès est définie dans le fichier security.yaml grâce à la règle </w:t>
-      </w:r>
-      <w:proofErr w:type="spellStart"/>
-      <w:r>
-        <w:rPr>
-          <w:sz w:val="32"/>
-          <w:szCs w:val="32"/>
-        </w:rPr>
-        <w:t>access_control</w:t>
-      </w:r>
-      <w:proofErr w:type="spellEnd"/>
-      <w:r>
-        <w:rPr>
-          <w:sz w:val="32"/>
-          <w:szCs w:val="32"/>
-        </w:rPr>
-        <w:t>, et renforcée dans les contrôleurs :</w:t>
+        <w:t>a sécurisation des accès est définie dans le fichier security.yaml grâce à la règle access_control, et renforcée dans les contrôleurs :</w:t>
       </w:r>
     </w:p>
     <w:p>
@@ -16196,7 +16036,7 @@
           <w:szCs w:val="32"/>
         </w:rPr>
         <w:drawing>
-          <wp:anchor distT="0" distB="0" distL="114300" distR="114300" simplePos="0" relativeHeight="251668992" behindDoc="1" locked="0" layoutInCell="1" allowOverlap="1" wp14:anchorId="41866AE7" wp14:editId="0087D4C7">
+          <wp:anchor distT="0" distB="0" distL="114300" distR="114300" simplePos="0" relativeHeight="251668992" behindDoc="1" locked="0" layoutInCell="1" allowOverlap="1" wp14:anchorId="41866AE7" wp14:editId="276A03C1">
             <wp:simplePos x="0" y="0"/>
             <wp:positionH relativeFrom="column">
               <wp:posOffset>-151130</wp:posOffset>
@@ -17349,23 +17189,7 @@
           <w:sz w:val="32"/>
           <w:szCs w:val="32"/>
         </w:rPr>
-        <w:t xml:space="preserve"> sont identiques </w:t>
-      </w:r>
-      <w:proofErr w:type="spellStart"/>
-      <w:r>
-        <w:rPr>
-          <w:sz w:val="32"/>
-          <w:szCs w:val="32"/>
-        </w:rPr>
-        <w:t>a</w:t>
-      </w:r>
-      <w:proofErr w:type="spellEnd"/>
-      <w:r>
-        <w:rPr>
-          <w:sz w:val="32"/>
-          <w:szCs w:val="32"/>
-        </w:rPr>
-        <w:t xml:space="preserve"> celles des </w:t>
+        <w:t xml:space="preserve"> sont identiques a celles des </w:t>
       </w:r>
       <w:r>
         <w:rPr>
@@ -17463,7 +17287,6 @@
     </w:p>
     <w:p>
       <w:pPr>
-        <w:jc w:val="center"/>
         <w:rPr>
           <w:sz w:val="40"/>
           <w:szCs w:val="40"/>
@@ -17473,7 +17296,6 @@
     </w:p>
     <w:p>
       <w:pPr>
-        <w:jc w:val="center"/>
         <w:rPr>
           <w:sz w:val="40"/>
           <w:szCs w:val="40"/>
@@ -17939,27 +17761,7 @@
           <w:highlight w:val="yellow"/>
           <w:lang w:val="en-GB"/>
         </w:rPr>
-        <w:t xml:space="preserve">{% if </w:t>
-      </w:r>
-      <w:proofErr w:type="spellStart"/>
-      <w:r>
-        <w:rPr>
-          <w:sz w:val="32"/>
-          <w:szCs w:val="32"/>
-          <w:highlight w:val="yellow"/>
-          <w:lang w:val="en-GB"/>
-        </w:rPr>
-        <w:t>seller.invoices|length</w:t>
-      </w:r>
-      <w:proofErr w:type="spellEnd"/>
-      <w:r>
-        <w:rPr>
-          <w:sz w:val="32"/>
-          <w:szCs w:val="32"/>
-          <w:highlight w:val="yellow"/>
-          <w:lang w:val="en-GB"/>
-        </w:rPr>
-        <w:t xml:space="preserve"> &gt; 0 %}</w:t>
+        <w:t>{% if seller.invoices|length &gt; 0 %}</w:t>
       </w:r>
     </w:p>
     <w:p>
@@ -17983,61 +17785,7 @@
           <w:szCs w:val="32"/>
           <w:lang w:val="en-GB"/>
         </w:rPr>
-        <w:t xml:space="preserve">    &lt;button class="</w:t>
-      </w:r>
-      <w:proofErr w:type="spellStart"/>
-      <w:r>
-        <w:rPr>
-          <w:sz w:val="32"/>
-          <w:szCs w:val="32"/>
-          <w:lang w:val="en-GB"/>
-        </w:rPr>
-        <w:t>btn</w:t>
-      </w:r>
-      <w:proofErr w:type="spellEnd"/>
-      <w:r>
-        <w:rPr>
-          <w:sz w:val="32"/>
-          <w:szCs w:val="32"/>
-          <w:lang w:val="en-GB"/>
-        </w:rPr>
-        <w:t xml:space="preserve"> </w:t>
-      </w:r>
-      <w:proofErr w:type="spellStart"/>
-      <w:r>
-        <w:rPr>
-          <w:sz w:val="32"/>
-          <w:szCs w:val="32"/>
-          <w:lang w:val="en-GB"/>
-        </w:rPr>
-        <w:t>btn-sm</w:t>
-      </w:r>
-      <w:proofErr w:type="spellEnd"/>
-      <w:r>
-        <w:rPr>
-          <w:sz w:val="32"/>
-          <w:szCs w:val="32"/>
-          <w:lang w:val="en-GB"/>
-        </w:rPr>
-        <w:t xml:space="preserve"> </w:t>
-      </w:r>
-      <w:proofErr w:type="spellStart"/>
-      <w:r>
-        <w:rPr>
-          <w:sz w:val="32"/>
-          <w:szCs w:val="32"/>
-          <w:lang w:val="en-GB"/>
-        </w:rPr>
-        <w:t>btn</w:t>
-      </w:r>
-      <w:proofErr w:type="spellEnd"/>
-      <w:r>
-        <w:rPr>
-          <w:sz w:val="32"/>
-          <w:szCs w:val="32"/>
-          <w:lang w:val="en-GB"/>
-        </w:rPr>
-        <w:t>-</w:t>
+        <w:t xml:space="preserve">    &lt;button class="btn btn-sm btn-</w:t>
       </w:r>
       <w:r>
         <w:rPr>
@@ -18087,25 +17835,7 @@
           <w:szCs w:val="32"/>
           <w:lang w:val="en-GB"/>
         </w:rPr>
-        <w:t xml:space="preserve">        &lt;</w:t>
-      </w:r>
-      <w:proofErr w:type="spellStart"/>
-      <w:r>
-        <w:rPr>
-          <w:sz w:val="32"/>
-          <w:szCs w:val="32"/>
-          <w:lang w:val="en-GB"/>
-        </w:rPr>
-        <w:t>i</w:t>
-      </w:r>
-      <w:proofErr w:type="spellEnd"/>
-      <w:r>
-        <w:rPr>
-          <w:sz w:val="32"/>
-          <w:szCs w:val="32"/>
-          <w:lang w:val="en-GB"/>
-        </w:rPr>
-        <w:t xml:space="preserve"> class="</w:t>
+        <w:t xml:space="preserve">        &lt;i class="</w:t>
       </w:r>
       <w:r>
         <w:rPr>
@@ -18125,25 +17855,7 @@
           <w:szCs w:val="32"/>
           <w:lang w:val="en-GB"/>
         </w:rPr>
-        <w:t>"&gt;&lt;/</w:t>
-      </w:r>
-      <w:proofErr w:type="spellStart"/>
-      <w:r>
-        <w:rPr>
-          <w:sz w:val="32"/>
-          <w:szCs w:val="32"/>
-          <w:lang w:val="en-GB"/>
-        </w:rPr>
-        <w:t>i</w:t>
-      </w:r>
-      <w:proofErr w:type="spellEnd"/>
-      <w:r>
-        <w:rPr>
-          <w:sz w:val="32"/>
-          <w:szCs w:val="32"/>
-          <w:lang w:val="en-GB"/>
-        </w:rPr>
-        <w:t>&gt;</w:t>
+        <w:t>"&gt;&lt;/i&gt;</w:t>
       </w:r>
     </w:p>
     <w:p>
@@ -18259,25 +17971,7 @@
           <w:szCs w:val="32"/>
           <w:highlight w:val="green"/>
         </w:rPr>
-        <w:t>route: '</w:t>
-      </w:r>
-      <w:proofErr w:type="spellStart"/>
-      <w:r>
-        <w:rPr>
-          <w:sz w:val="32"/>
-          <w:szCs w:val="32"/>
-          <w:highlight w:val="green"/>
-        </w:rPr>
-        <w:t>app_seller_delete</w:t>
-      </w:r>
-      <w:proofErr w:type="spellEnd"/>
-      <w:r>
-        <w:rPr>
-          <w:sz w:val="32"/>
-          <w:szCs w:val="32"/>
-          <w:highlight w:val="green"/>
-        </w:rPr>
-        <w:t>',</w:t>
+        <w:t>route: 'app_seller_delete',</w:t>
       </w:r>
     </w:p>
     <w:p>
@@ -18344,23 +18038,7 @@
           <w:sz w:val="32"/>
           <w:szCs w:val="32"/>
         </w:rPr>
-        <w:t xml:space="preserve">{% </w:t>
-      </w:r>
-      <w:proofErr w:type="spellStart"/>
-      <w:r>
-        <w:rPr>
-          <w:sz w:val="32"/>
-          <w:szCs w:val="32"/>
-        </w:rPr>
-        <w:t>endif</w:t>
-      </w:r>
-      <w:proofErr w:type="spellEnd"/>
-      <w:r>
-        <w:rPr>
-          <w:sz w:val="32"/>
-          <w:szCs w:val="32"/>
-        </w:rPr>
-        <w:t xml:space="preserve"> %}</w:t>
+        <w:t>{% endif %}</w:t>
       </w:r>
     </w:p>
     <w:p>
@@ -18675,61 +18353,7 @@
           <w:szCs w:val="32"/>
           <w:lang w:val="en-GB"/>
         </w:rPr>
-        <w:t xml:space="preserve">    &lt;button class="</w:t>
-      </w:r>
-      <w:proofErr w:type="spellStart"/>
-      <w:r>
-        <w:rPr>
-          <w:sz w:val="32"/>
-          <w:szCs w:val="32"/>
-          <w:lang w:val="en-GB"/>
-        </w:rPr>
-        <w:t>btn</w:t>
-      </w:r>
-      <w:proofErr w:type="spellEnd"/>
-      <w:r>
-        <w:rPr>
-          <w:sz w:val="32"/>
-          <w:szCs w:val="32"/>
-          <w:lang w:val="en-GB"/>
-        </w:rPr>
-        <w:t xml:space="preserve"> </w:t>
-      </w:r>
-      <w:proofErr w:type="spellStart"/>
-      <w:r>
-        <w:rPr>
-          <w:sz w:val="32"/>
-          <w:szCs w:val="32"/>
-          <w:lang w:val="en-GB"/>
-        </w:rPr>
-        <w:t>btn-sm</w:t>
-      </w:r>
-      <w:proofErr w:type="spellEnd"/>
-      <w:r>
-        <w:rPr>
-          <w:sz w:val="32"/>
-          <w:szCs w:val="32"/>
-          <w:lang w:val="en-GB"/>
-        </w:rPr>
-        <w:t xml:space="preserve"> </w:t>
-      </w:r>
-      <w:proofErr w:type="spellStart"/>
-      <w:r>
-        <w:rPr>
-          <w:sz w:val="32"/>
-          <w:szCs w:val="32"/>
-          <w:lang w:val="en-GB"/>
-        </w:rPr>
-        <w:t>btn</w:t>
-      </w:r>
-      <w:proofErr w:type="spellEnd"/>
-      <w:r>
-        <w:rPr>
-          <w:sz w:val="32"/>
-          <w:szCs w:val="32"/>
-          <w:lang w:val="en-GB"/>
-        </w:rPr>
-        <w:t>-secondary" disabled&gt;</w:t>
+        <w:t xml:space="preserve">    &lt;button class="btn btn-sm btn-secondary" disabled&gt;</w:t>
       </w:r>
     </w:p>
     <w:p>
@@ -18855,61 +18479,7 @@
           <w:szCs w:val="32"/>
           <w:lang w:val="en-GB"/>
         </w:rPr>
-        <w:t xml:space="preserve">    class="</w:t>
-      </w:r>
-      <w:proofErr w:type="spellStart"/>
-      <w:r>
-        <w:rPr>
-          <w:sz w:val="32"/>
-          <w:szCs w:val="32"/>
-          <w:lang w:val="en-GB"/>
-        </w:rPr>
-        <w:t>btn</w:t>
-      </w:r>
-      <w:proofErr w:type="spellEnd"/>
-      <w:r>
-        <w:rPr>
-          <w:sz w:val="32"/>
-          <w:szCs w:val="32"/>
-          <w:lang w:val="en-GB"/>
-        </w:rPr>
-        <w:t xml:space="preserve"> </w:t>
-      </w:r>
-      <w:proofErr w:type="spellStart"/>
-      <w:r>
-        <w:rPr>
-          <w:sz w:val="32"/>
-          <w:szCs w:val="32"/>
-          <w:lang w:val="en-GB"/>
-        </w:rPr>
-        <w:t>btn-sm</w:t>
-      </w:r>
-      <w:proofErr w:type="spellEnd"/>
-      <w:r>
-        <w:rPr>
-          <w:sz w:val="32"/>
-          <w:szCs w:val="32"/>
-          <w:lang w:val="en-GB"/>
-        </w:rPr>
-        <w:t xml:space="preserve"> </w:t>
-      </w:r>
-      <w:proofErr w:type="spellStart"/>
-      <w:r>
-        <w:rPr>
-          <w:sz w:val="32"/>
-          <w:szCs w:val="32"/>
-          <w:lang w:val="en-GB"/>
-        </w:rPr>
-        <w:t>btn</w:t>
-      </w:r>
-      <w:proofErr w:type="spellEnd"/>
-      <w:r>
-        <w:rPr>
-          <w:sz w:val="32"/>
-          <w:szCs w:val="32"/>
-          <w:lang w:val="en-GB"/>
-        </w:rPr>
-        <w:t>-danger"</w:t>
+        <w:t xml:space="preserve">    class="btn btn-sm btn-danger"</w:t>
       </w:r>
     </w:p>
     <w:p>
@@ -18940,61 +18510,7 @@
           <w:szCs w:val="32"/>
           <w:lang w:val="it-IT"/>
         </w:rPr>
-        <w:t>data-</w:t>
-      </w:r>
-      <w:proofErr w:type="spellStart"/>
-      <w:r>
-        <w:rPr>
-          <w:sz w:val="32"/>
-          <w:szCs w:val="32"/>
-          <w:lang w:val="it-IT"/>
-        </w:rPr>
-        <w:t>bs</w:t>
-      </w:r>
-      <w:proofErr w:type="spellEnd"/>
-      <w:r>
-        <w:rPr>
-          <w:sz w:val="32"/>
-          <w:szCs w:val="32"/>
-          <w:lang w:val="it-IT"/>
-        </w:rPr>
-        <w:t>-</w:t>
-      </w:r>
-      <w:proofErr w:type="spellStart"/>
-      <w:r>
-        <w:rPr>
-          <w:sz w:val="32"/>
-          <w:szCs w:val="32"/>
-          <w:lang w:val="it-IT"/>
-        </w:rPr>
-        <w:t>toggle</w:t>
-      </w:r>
-      <w:proofErr w:type="spellEnd"/>
-      <w:r>
-        <w:rPr>
-          <w:sz w:val="32"/>
-          <w:szCs w:val="32"/>
-          <w:lang w:val="it-IT"/>
-        </w:rPr>
-        <w:t>="</w:t>
-      </w:r>
-      <w:proofErr w:type="spellStart"/>
-      <w:r>
-        <w:rPr>
-          <w:sz w:val="32"/>
-          <w:szCs w:val="32"/>
-          <w:lang w:val="it-IT"/>
-        </w:rPr>
-        <w:t>modal</w:t>
-      </w:r>
-      <w:proofErr w:type="spellEnd"/>
-      <w:r>
-        <w:rPr>
-          <w:sz w:val="32"/>
-          <w:szCs w:val="32"/>
-          <w:lang w:val="it-IT"/>
-        </w:rPr>
-        <w:t>"</w:t>
+        <w:t>data-bs-toggle="modal"</w:t>
       </w:r>
     </w:p>
     <w:p>
@@ -19017,53 +18533,7 @@
           <w:szCs w:val="32"/>
           <w:lang w:val="it-IT"/>
         </w:rPr>
-        <w:t xml:space="preserve">    data-</w:t>
-      </w:r>
-      <w:proofErr w:type="spellStart"/>
-      <w:r>
-        <w:rPr>
-          <w:sz w:val="32"/>
-          <w:szCs w:val="32"/>
-          <w:lang w:val="it-IT"/>
-        </w:rPr>
-        <w:t>bs</w:t>
-      </w:r>
-      <w:proofErr w:type="spellEnd"/>
-      <w:r>
-        <w:rPr>
-          <w:sz w:val="32"/>
-          <w:szCs w:val="32"/>
-          <w:lang w:val="it-IT"/>
-        </w:rPr>
-        <w:t>-target="</w:t>
-      </w:r>
-      <w:proofErr w:type="gramStart"/>
-      <w:r>
-        <w:rPr>
-          <w:sz w:val="32"/>
-          <w:szCs w:val="32"/>
-          <w:lang w:val="it-IT"/>
-        </w:rPr>
-        <w:t xml:space="preserve">#{{ </w:t>
-      </w:r>
-      <w:proofErr w:type="spellStart"/>
-      <w:r>
-        <w:rPr>
-          <w:sz w:val="32"/>
-          <w:szCs w:val="32"/>
-          <w:lang w:val="it-IT"/>
-        </w:rPr>
-        <w:t>modalId</w:t>
-      </w:r>
-      <w:proofErr w:type="spellEnd"/>
-      <w:proofErr w:type="gramEnd"/>
-      <w:r>
-        <w:rPr>
-          <w:sz w:val="32"/>
-          <w:szCs w:val="32"/>
-          <w:lang w:val="it-IT"/>
-        </w:rPr>
-        <w:t xml:space="preserve"> }}"</w:t>
+        <w:t xml:space="preserve">    data-bs-target="#{{ modalId }}"</w:t>
       </w:r>
     </w:p>
     <w:p>
@@ -19111,23 +18581,7 @@
           <w:sz w:val="32"/>
           <w:szCs w:val="32"/>
         </w:rPr>
-        <w:t>haque modal possède un identifiant unique (</w:t>
-      </w:r>
-      <w:proofErr w:type="spellStart"/>
-      <w:r>
-        <w:rPr>
-          <w:sz w:val="32"/>
-          <w:szCs w:val="32"/>
-        </w:rPr>
-        <w:t>modalId</w:t>
-      </w:r>
-      <w:proofErr w:type="spellEnd"/>
-      <w:r>
-        <w:rPr>
-          <w:sz w:val="32"/>
-          <w:szCs w:val="32"/>
-        </w:rPr>
-        <w:t>) afin d’éviter les conflits dans la page.</w:t>
+        <w:t>haque modal possède un identifiant unique (modalId) afin d’éviter les conflits dans la page.</w:t>
       </w:r>
     </w:p>
     <w:p>
@@ -19215,39 +18669,7 @@
           <w:sz w:val="32"/>
           <w:szCs w:val="32"/>
         </w:rPr>
-        <w:t>&lt;</w:t>
-      </w:r>
-      <w:proofErr w:type="spellStart"/>
-      <w:r>
-        <w:rPr>
-          <w:sz w:val="32"/>
-          <w:szCs w:val="32"/>
-        </w:rPr>
-        <w:t>form</w:t>
-      </w:r>
-      <w:proofErr w:type="spellEnd"/>
-      <w:r>
-        <w:rPr>
-          <w:sz w:val="32"/>
-          <w:szCs w:val="32"/>
-        </w:rPr>
-        <w:t xml:space="preserve"> </w:t>
-      </w:r>
-      <w:proofErr w:type="spellStart"/>
-      <w:r>
-        <w:rPr>
-          <w:sz w:val="32"/>
-          <w:szCs w:val="32"/>
-        </w:rPr>
-        <w:t>method</w:t>
-      </w:r>
-      <w:proofErr w:type="spellEnd"/>
-      <w:r>
-        <w:rPr>
-          <w:sz w:val="32"/>
-          <w:szCs w:val="32"/>
-        </w:rPr>
-        <w:t>="post" action="{{ path(route, {'id': id}) }}"&gt;</w:t>
+        <w:t>&lt;form method="post" action="{{ path(route, {'id': id}) }}"&gt;</w:t>
       </w:r>
       <w:r>
         <w:rPr>
@@ -19255,55 +18677,7 @@
           <w:szCs w:val="32"/>
         </w:rPr>
         <w:br/>
-        <w:t xml:space="preserve">    &lt;input type="</w:t>
-      </w:r>
-      <w:proofErr w:type="spellStart"/>
-      <w:r>
-        <w:rPr>
-          <w:sz w:val="32"/>
-          <w:szCs w:val="32"/>
-        </w:rPr>
-        <w:t>hidden</w:t>
-      </w:r>
-      <w:proofErr w:type="spellEnd"/>
-      <w:r>
-        <w:rPr>
-          <w:sz w:val="32"/>
-          <w:szCs w:val="32"/>
-        </w:rPr>
-        <w:t xml:space="preserve">" </w:t>
-      </w:r>
-      <w:proofErr w:type="spellStart"/>
-      <w:r>
-        <w:rPr>
-          <w:sz w:val="32"/>
-          <w:szCs w:val="32"/>
-        </w:rPr>
-        <w:t>name</w:t>
-      </w:r>
-      <w:proofErr w:type="spellEnd"/>
-      <w:r>
-        <w:rPr>
-          <w:sz w:val="32"/>
-          <w:szCs w:val="32"/>
-        </w:rPr>
-        <w:t>="_</w:t>
-      </w:r>
-      <w:proofErr w:type="spellStart"/>
-      <w:r>
-        <w:rPr>
-          <w:sz w:val="32"/>
-          <w:szCs w:val="32"/>
-        </w:rPr>
-        <w:t>token</w:t>
-      </w:r>
-      <w:proofErr w:type="spellEnd"/>
-      <w:r>
-        <w:rPr>
-          <w:sz w:val="32"/>
-          <w:szCs w:val="32"/>
-        </w:rPr>
-        <w:t>" value="{{ csrf_token('delete' ~ id) }}"&gt;</w:t>
+        <w:t xml:space="preserve">    &lt;input type="hidden" name="_token" value="{{ csrf_token('delete' ~ id) }}"&gt;</w:t>
       </w:r>
     </w:p>
     <w:p>
@@ -19355,7 +18729,6 @@
           <w:szCs w:val="32"/>
         </w:rPr>
       </w:pPr>
-      <w:proofErr w:type="spellStart"/>
       <w:r>
         <w:rPr>
           <w:b/>
@@ -19364,17 +18737,7 @@
           <w:szCs w:val="32"/>
         </w:rPr>
         <w:lastRenderedPageBreak/>
-        <w:t>Worflow</w:t>
-      </w:r>
-      <w:proofErr w:type="spellEnd"/>
-      <w:r>
-        <w:rPr>
-          <w:b/>
-          <w:bCs/>
-          <w:sz w:val="32"/>
-          <w:szCs w:val="32"/>
-        </w:rPr>
-        <w:t xml:space="preserve"> du bouton delete</w:t>
+        <w:t>Worflow du bouton delete</w:t>
       </w:r>
     </w:p>
     <w:p>
@@ -20012,6 +19375,9 @@
       <w:pPr>
         <w:pStyle w:val="Sous-titre"/>
         <w:spacing w:line="240" w:lineRule="auto"/>
+        <w:rPr>
+          <w:lang w:val="en-GB"/>
+        </w:rPr>
       </w:pPr>
     </w:p>
     <w:p>
@@ -20422,25 +19788,7 @@
           <w:szCs w:val="32"/>
           <w:lang w:val="en-GB"/>
         </w:rPr>
-        <w:t xml:space="preserve">public function </w:t>
-      </w:r>
-      <w:proofErr w:type="spellStart"/>
-      <w:r>
-        <w:rPr>
-          <w:sz w:val="32"/>
-          <w:szCs w:val="32"/>
-          <w:lang w:val="en-GB"/>
-        </w:rPr>
-        <w:t>getTotalHt</w:t>
-      </w:r>
-      <w:proofErr w:type="spellEnd"/>
-      <w:r>
-        <w:rPr>
-          <w:sz w:val="32"/>
-          <w:szCs w:val="32"/>
-          <w:lang w:val="en-GB"/>
-        </w:rPr>
-        <w:t>(): string</w:t>
+        <w:t>public function getTotalHt(): string</w:t>
       </w:r>
       <w:r>
         <w:rPr>
@@ -20484,25 +19832,7 @@
           <w:lang w:val="en-GB"/>
         </w:rPr>
         <w:br/>
-        <w:t xml:space="preserve">    return </w:t>
-      </w:r>
-      <w:proofErr w:type="spellStart"/>
-      <w:r>
-        <w:rPr>
-          <w:sz w:val="32"/>
-          <w:szCs w:val="32"/>
-          <w:lang w:val="en-GB"/>
-        </w:rPr>
-        <w:t>number_format</w:t>
-      </w:r>
-      <w:proofErr w:type="spellEnd"/>
-      <w:r>
-        <w:rPr>
-          <w:sz w:val="32"/>
-          <w:szCs w:val="32"/>
-          <w:lang w:val="en-GB"/>
-        </w:rPr>
-        <w:t>($price * $quantity, 2, '.', '');</w:t>
+        <w:t xml:space="preserve">    return number_format($price * $quantity, 2, '.', '');</w:t>
       </w:r>
       <w:r>
         <w:rPr>
@@ -20567,25 +19897,7 @@
           <w:szCs w:val="32"/>
           <w:lang w:val="en-GB"/>
         </w:rPr>
-        <w:t xml:space="preserve">public function </w:t>
-      </w:r>
-      <w:proofErr w:type="spellStart"/>
-      <w:r>
-        <w:rPr>
-          <w:sz w:val="32"/>
-          <w:szCs w:val="32"/>
-          <w:lang w:val="en-GB"/>
-        </w:rPr>
-        <w:t>getVatAmount</w:t>
-      </w:r>
-      <w:proofErr w:type="spellEnd"/>
-      <w:r>
-        <w:rPr>
-          <w:sz w:val="32"/>
-          <w:szCs w:val="32"/>
-          <w:lang w:val="en-GB"/>
-        </w:rPr>
-        <w:t>(): string</w:t>
+        <w:t>public function getVatAmount(): string</w:t>
       </w:r>
       <w:r>
         <w:rPr>
@@ -20603,88 +19915,16 @@
           <w:lang w:val="en-GB"/>
         </w:rPr>
         <w:br/>
-        <w:t xml:space="preserve">    $</w:t>
-      </w:r>
-      <w:proofErr w:type="spellStart"/>
+        <w:t xml:space="preserve">    $totalHt = (float) $this-&gt;getTotalHt();</w:t>
+      </w:r>
       <w:r>
         <w:rPr>
           <w:sz w:val="32"/>
           <w:szCs w:val="32"/>
           <w:lang w:val="en-GB"/>
         </w:rPr>
-        <w:t>totalHt</w:t>
-      </w:r>
-      <w:proofErr w:type="spellEnd"/>
-      <w:r>
-        <w:rPr>
-          <w:sz w:val="32"/>
-          <w:szCs w:val="32"/>
-          <w:lang w:val="en-GB"/>
-        </w:rPr>
-        <w:t xml:space="preserve"> = (float) $this-&gt;</w:t>
-      </w:r>
-      <w:proofErr w:type="spellStart"/>
-      <w:r>
-        <w:rPr>
-          <w:sz w:val="32"/>
-          <w:szCs w:val="32"/>
-          <w:lang w:val="en-GB"/>
-        </w:rPr>
-        <w:t>getTotalHt</w:t>
-      </w:r>
-      <w:proofErr w:type="spellEnd"/>
-      <w:r>
-        <w:rPr>
-          <w:sz w:val="32"/>
-          <w:szCs w:val="32"/>
-          <w:lang w:val="en-GB"/>
-        </w:rPr>
-        <w:t>();</w:t>
-      </w:r>
-      <w:r>
-        <w:rPr>
-          <w:sz w:val="32"/>
-          <w:szCs w:val="32"/>
-          <w:lang w:val="en-GB"/>
-        </w:rPr>
         <w:br/>
-        <w:t xml:space="preserve">    $</w:t>
-      </w:r>
-      <w:proofErr w:type="spellStart"/>
-      <w:r>
-        <w:rPr>
-          <w:sz w:val="32"/>
-          <w:szCs w:val="32"/>
-          <w:lang w:val="en-GB"/>
-        </w:rPr>
-        <w:t>vatRate</w:t>
-      </w:r>
-      <w:proofErr w:type="spellEnd"/>
-      <w:r>
-        <w:rPr>
-          <w:sz w:val="32"/>
-          <w:szCs w:val="32"/>
-          <w:lang w:val="en-GB"/>
-        </w:rPr>
-        <w:t xml:space="preserve"> = (float) ($this-&gt;</w:t>
-      </w:r>
-      <w:proofErr w:type="spellStart"/>
-      <w:r>
-        <w:rPr>
-          <w:sz w:val="32"/>
-          <w:szCs w:val="32"/>
-          <w:lang w:val="en-GB"/>
-        </w:rPr>
-        <w:t>vatRate</w:t>
-      </w:r>
-      <w:proofErr w:type="spellEnd"/>
-      <w:r>
-        <w:rPr>
-          <w:sz w:val="32"/>
-          <w:szCs w:val="32"/>
-          <w:lang w:val="en-GB"/>
-        </w:rPr>
-        <w:t xml:space="preserve"> ?? </w:t>
+        <w:t xml:space="preserve">    $vatRate = (float) ($this-&gt;vatRate ?? </w:t>
       </w:r>
       <w:r>
         <w:rPr>
@@ -20706,55 +19946,7 @@
           <w:szCs w:val="32"/>
         </w:rPr>
         <w:br/>
-        <w:t xml:space="preserve">    return </w:t>
-      </w:r>
-      <w:proofErr w:type="spellStart"/>
-      <w:r>
-        <w:rPr>
-          <w:sz w:val="32"/>
-          <w:szCs w:val="32"/>
-        </w:rPr>
-        <w:t>number_format</w:t>
-      </w:r>
-      <w:proofErr w:type="spellEnd"/>
-      <w:r>
-        <w:rPr>
-          <w:sz w:val="32"/>
-          <w:szCs w:val="32"/>
-        </w:rPr>
-        <w:t>($</w:t>
-      </w:r>
-      <w:proofErr w:type="spellStart"/>
-      <w:r>
-        <w:rPr>
-          <w:sz w:val="32"/>
-          <w:szCs w:val="32"/>
-        </w:rPr>
-        <w:t>totalHt</w:t>
-      </w:r>
-      <w:proofErr w:type="spellEnd"/>
-      <w:r>
-        <w:rPr>
-          <w:sz w:val="32"/>
-          <w:szCs w:val="32"/>
-        </w:rPr>
-        <w:t xml:space="preserve"> * ($</w:t>
-      </w:r>
-      <w:proofErr w:type="spellStart"/>
-      <w:r>
-        <w:rPr>
-          <w:sz w:val="32"/>
-          <w:szCs w:val="32"/>
-        </w:rPr>
-        <w:t>vatRate</w:t>
-      </w:r>
-      <w:proofErr w:type="spellEnd"/>
-      <w:r>
-        <w:rPr>
-          <w:sz w:val="32"/>
-          <w:szCs w:val="32"/>
-        </w:rPr>
-        <w:t xml:space="preserve"> / 100), 2, '.', '');</w:t>
+        <w:t xml:space="preserve">    return number_format($totalHt * ($vatRate / 100), 2, '.', '');</w:t>
       </w:r>
       <w:r>
         <w:rPr>
@@ -20850,25 +20042,7 @@
           <w:szCs w:val="32"/>
           <w:lang w:val="en-GB"/>
         </w:rPr>
-        <w:t xml:space="preserve">public function </w:t>
-      </w:r>
-      <w:proofErr w:type="spellStart"/>
-      <w:r>
-        <w:rPr>
-          <w:sz w:val="32"/>
-          <w:szCs w:val="32"/>
-          <w:lang w:val="en-GB"/>
-        </w:rPr>
-        <w:t>getTotalTtc</w:t>
-      </w:r>
-      <w:proofErr w:type="spellEnd"/>
-      <w:r>
-        <w:rPr>
-          <w:sz w:val="32"/>
-          <w:szCs w:val="32"/>
-          <w:lang w:val="en-GB"/>
-        </w:rPr>
-        <w:t>(): string</w:t>
+        <w:t>public function getTotalTtc(): string</w:t>
       </w:r>
       <w:r>
         <w:rPr>
@@ -20886,88 +20060,16 @@
           <w:lang w:val="en-GB"/>
         </w:rPr>
         <w:br/>
-        <w:t xml:space="preserve">    $</w:t>
-      </w:r>
-      <w:proofErr w:type="spellStart"/>
+        <w:t xml:space="preserve">    $totalHt = (float) $this-&gt;getTotalHt();</w:t>
+      </w:r>
       <w:r>
         <w:rPr>
           <w:sz w:val="32"/>
           <w:szCs w:val="32"/>
           <w:lang w:val="en-GB"/>
         </w:rPr>
-        <w:t>totalHt</w:t>
-      </w:r>
-      <w:proofErr w:type="spellEnd"/>
-      <w:r>
-        <w:rPr>
-          <w:sz w:val="32"/>
-          <w:szCs w:val="32"/>
-          <w:lang w:val="en-GB"/>
-        </w:rPr>
-        <w:t xml:space="preserve"> = (float) $this-&gt;</w:t>
-      </w:r>
-      <w:proofErr w:type="spellStart"/>
-      <w:r>
-        <w:rPr>
-          <w:sz w:val="32"/>
-          <w:szCs w:val="32"/>
-          <w:lang w:val="en-GB"/>
-        </w:rPr>
-        <w:t>getTotalHt</w:t>
-      </w:r>
-      <w:proofErr w:type="spellEnd"/>
-      <w:r>
-        <w:rPr>
-          <w:sz w:val="32"/>
-          <w:szCs w:val="32"/>
-          <w:lang w:val="en-GB"/>
-        </w:rPr>
-        <w:t>();</w:t>
-      </w:r>
-      <w:r>
-        <w:rPr>
-          <w:sz w:val="32"/>
-          <w:szCs w:val="32"/>
-          <w:lang w:val="en-GB"/>
-        </w:rPr>
         <w:br/>
-        <w:t xml:space="preserve">    $</w:t>
-      </w:r>
-      <w:proofErr w:type="spellStart"/>
-      <w:r>
-        <w:rPr>
-          <w:sz w:val="32"/>
-          <w:szCs w:val="32"/>
-          <w:lang w:val="en-GB"/>
-        </w:rPr>
-        <w:t>vatAmount</w:t>
-      </w:r>
-      <w:proofErr w:type="spellEnd"/>
-      <w:r>
-        <w:rPr>
-          <w:sz w:val="32"/>
-          <w:szCs w:val="32"/>
-          <w:lang w:val="en-GB"/>
-        </w:rPr>
-        <w:t xml:space="preserve"> = (float) $this-&gt;</w:t>
-      </w:r>
-      <w:proofErr w:type="spellStart"/>
-      <w:r>
-        <w:rPr>
-          <w:sz w:val="32"/>
-          <w:szCs w:val="32"/>
-          <w:lang w:val="en-GB"/>
-        </w:rPr>
-        <w:t>getVatAmount</w:t>
-      </w:r>
-      <w:proofErr w:type="spellEnd"/>
-      <w:r>
-        <w:rPr>
-          <w:sz w:val="32"/>
-          <w:szCs w:val="32"/>
-          <w:lang w:val="en-GB"/>
-        </w:rPr>
-        <w:t>();</w:t>
+        <w:t xml:space="preserve">    $vatAmount = (float) $this-&gt;getVatAmount();</w:t>
       </w:r>
       <w:r>
         <w:rPr>
@@ -20986,7 +20088,6 @@
         <w:br/>
         <w:t xml:space="preserve">    return </w:t>
       </w:r>
-      <w:proofErr w:type="spellStart"/>
       <w:r>
         <w:rPr>
           <w:sz w:val="32"/>
@@ -20994,57 +20095,7 @@
           <w:highlight w:val="yellow"/>
           <w:lang w:val="en-GB"/>
         </w:rPr>
-        <w:t>number_format</w:t>
-      </w:r>
-      <w:proofErr w:type="spellEnd"/>
-      <w:r>
-        <w:rPr>
-          <w:sz w:val="32"/>
-          <w:szCs w:val="32"/>
-          <w:highlight w:val="yellow"/>
-          <w:lang w:val="en-GB"/>
-        </w:rPr>
-        <w:t>($</w:t>
-      </w:r>
-      <w:proofErr w:type="spellStart"/>
-      <w:r>
-        <w:rPr>
-          <w:sz w:val="32"/>
-          <w:szCs w:val="32"/>
-          <w:highlight w:val="yellow"/>
-          <w:lang w:val="en-GB"/>
-        </w:rPr>
-        <w:t>totalHt</w:t>
-      </w:r>
-      <w:proofErr w:type="spellEnd"/>
-      <w:r>
-        <w:rPr>
-          <w:sz w:val="32"/>
-          <w:szCs w:val="32"/>
-          <w:highlight w:val="yellow"/>
-          <w:lang w:val="en-GB"/>
-        </w:rPr>
-        <w:t xml:space="preserve"> + $</w:t>
-      </w:r>
-      <w:proofErr w:type="spellStart"/>
-      <w:r>
-        <w:rPr>
-          <w:sz w:val="32"/>
-          <w:szCs w:val="32"/>
-          <w:highlight w:val="yellow"/>
-          <w:lang w:val="en-GB"/>
-        </w:rPr>
-        <w:t>vatAmount</w:t>
-      </w:r>
-      <w:proofErr w:type="spellEnd"/>
-      <w:r>
-        <w:rPr>
-          <w:sz w:val="32"/>
-          <w:szCs w:val="32"/>
-          <w:highlight w:val="yellow"/>
-          <w:lang w:val="en-GB"/>
-        </w:rPr>
-        <w:t>, 2, '.', '');</w:t>
+        <w:t>number_format($totalHt + $vatAmount, 2, '.', '');</w:t>
       </w:r>
       <w:r>
         <w:rPr>
@@ -21129,25 +20180,7 @@
           <w:szCs w:val="32"/>
           <w:lang w:val="en-GB"/>
         </w:rPr>
-        <w:t xml:space="preserve">public function </w:t>
-      </w:r>
-      <w:proofErr w:type="spellStart"/>
-      <w:r>
-        <w:rPr>
-          <w:sz w:val="32"/>
-          <w:szCs w:val="32"/>
-          <w:lang w:val="en-GB"/>
-        </w:rPr>
-        <w:t>getGrandTotalHt</w:t>
-      </w:r>
-      <w:proofErr w:type="spellEnd"/>
-      <w:r>
-        <w:rPr>
-          <w:sz w:val="32"/>
-          <w:szCs w:val="32"/>
-          <w:lang w:val="en-GB"/>
-        </w:rPr>
-        <w:t>(): string</w:t>
+        <w:t>public function getGrandTotalHt(): string</w:t>
       </w:r>
       <w:r>
         <w:rPr>
@@ -21174,52 +20207,16 @@
           <w:lang w:val="en-GB"/>
         </w:rPr>
         <w:br/>
-        <w:t xml:space="preserve">    foreach ($this-&gt;</w:t>
-      </w:r>
-      <w:proofErr w:type="spellStart"/>
+        <w:t xml:space="preserve">    foreach ($this-&gt;invoiceItems as $item) {</w:t>
+      </w:r>
       <w:r>
         <w:rPr>
           <w:sz w:val="32"/>
           <w:szCs w:val="32"/>
           <w:lang w:val="en-GB"/>
         </w:rPr>
-        <w:t>invoiceItems</w:t>
-      </w:r>
-      <w:proofErr w:type="spellEnd"/>
-      <w:r>
-        <w:rPr>
-          <w:sz w:val="32"/>
-          <w:szCs w:val="32"/>
-          <w:lang w:val="en-GB"/>
-        </w:rPr>
-        <w:t xml:space="preserve"> as $item) {</w:t>
-      </w:r>
-      <w:r>
-        <w:rPr>
-          <w:sz w:val="32"/>
-          <w:szCs w:val="32"/>
-          <w:lang w:val="en-GB"/>
-        </w:rPr>
         <w:br/>
-        <w:t xml:space="preserve">        $total += (float) $item-&gt;</w:t>
-      </w:r>
-      <w:proofErr w:type="spellStart"/>
-      <w:r>
-        <w:rPr>
-          <w:sz w:val="32"/>
-          <w:szCs w:val="32"/>
-          <w:lang w:val="en-GB"/>
-        </w:rPr>
-        <w:t>getTotalHt</w:t>
-      </w:r>
-      <w:proofErr w:type="spellEnd"/>
-      <w:r>
-        <w:rPr>
-          <w:sz w:val="32"/>
-          <w:szCs w:val="32"/>
-          <w:lang w:val="en-GB"/>
-        </w:rPr>
-        <w:t>();</w:t>
+        <w:t xml:space="preserve">        $total += (float) $item-&gt;getTotalHt();</w:t>
       </w:r>
       <w:r>
         <w:rPr>
@@ -21237,25 +20234,7 @@
           <w:lang w:val="en-GB"/>
         </w:rPr>
         <w:br/>
-        <w:t xml:space="preserve">    return </w:t>
-      </w:r>
-      <w:proofErr w:type="spellStart"/>
-      <w:r>
-        <w:rPr>
-          <w:sz w:val="32"/>
-          <w:szCs w:val="32"/>
-          <w:lang w:val="en-GB"/>
-        </w:rPr>
-        <w:t>number_format</w:t>
-      </w:r>
-      <w:proofErr w:type="spellEnd"/>
-      <w:r>
-        <w:rPr>
-          <w:sz w:val="32"/>
-          <w:szCs w:val="32"/>
-          <w:lang w:val="en-GB"/>
-        </w:rPr>
-        <w:t>($total, 2, '.', '');</w:t>
+        <w:t xml:space="preserve">    return number_format($total, 2, '.', '');</w:t>
       </w:r>
       <w:r>
         <w:rPr>
@@ -21312,25 +20291,7 @@
           <w:szCs w:val="32"/>
           <w:lang w:val="en-GB"/>
         </w:rPr>
-        <w:t xml:space="preserve">public function </w:t>
-      </w:r>
-      <w:proofErr w:type="spellStart"/>
-      <w:r>
-        <w:rPr>
-          <w:sz w:val="32"/>
-          <w:szCs w:val="32"/>
-          <w:lang w:val="en-GB"/>
-        </w:rPr>
-        <w:t>getGrandVatAmount</w:t>
-      </w:r>
-      <w:proofErr w:type="spellEnd"/>
-      <w:r>
-        <w:rPr>
-          <w:sz w:val="32"/>
-          <w:szCs w:val="32"/>
-          <w:lang w:val="en-GB"/>
-        </w:rPr>
-        <w:t>(): string</w:t>
+        <w:t>public function getGrandVatAmount(): string</w:t>
       </w:r>
       <w:r>
         <w:rPr>
@@ -21357,52 +20318,16 @@
           <w:lang w:val="en-GB"/>
         </w:rPr>
         <w:br/>
-        <w:t xml:space="preserve">    foreach ($this-&gt;</w:t>
-      </w:r>
-      <w:proofErr w:type="spellStart"/>
+        <w:t xml:space="preserve">    foreach ($this-&gt;invoiceItems as $item) {</w:t>
+      </w:r>
       <w:r>
         <w:rPr>
           <w:sz w:val="32"/>
           <w:szCs w:val="32"/>
           <w:lang w:val="en-GB"/>
         </w:rPr>
-        <w:t>invoiceItems</w:t>
-      </w:r>
-      <w:proofErr w:type="spellEnd"/>
-      <w:r>
-        <w:rPr>
-          <w:sz w:val="32"/>
-          <w:szCs w:val="32"/>
-          <w:lang w:val="en-GB"/>
-        </w:rPr>
-        <w:t xml:space="preserve"> as $item) {</w:t>
-      </w:r>
-      <w:r>
-        <w:rPr>
-          <w:sz w:val="32"/>
-          <w:szCs w:val="32"/>
-          <w:lang w:val="en-GB"/>
-        </w:rPr>
         <w:br/>
-        <w:t xml:space="preserve">        $total += (float) $item-&gt;</w:t>
-      </w:r>
-      <w:proofErr w:type="spellStart"/>
-      <w:r>
-        <w:rPr>
-          <w:sz w:val="32"/>
-          <w:szCs w:val="32"/>
-          <w:lang w:val="en-GB"/>
-        </w:rPr>
-        <w:t>getVatAmount</w:t>
-      </w:r>
-      <w:proofErr w:type="spellEnd"/>
-      <w:r>
-        <w:rPr>
-          <w:sz w:val="32"/>
-          <w:szCs w:val="32"/>
-          <w:lang w:val="en-GB"/>
-        </w:rPr>
-        <w:t>();</w:t>
+        <w:t xml:space="preserve">        $total += (float) $item-&gt;getVatAmount();</w:t>
       </w:r>
       <w:r>
         <w:rPr>
@@ -21420,25 +20345,7 @@
           <w:lang w:val="en-GB"/>
         </w:rPr>
         <w:br/>
-        <w:t xml:space="preserve">    return </w:t>
-      </w:r>
-      <w:proofErr w:type="spellStart"/>
-      <w:r>
-        <w:rPr>
-          <w:sz w:val="32"/>
-          <w:szCs w:val="32"/>
-          <w:lang w:val="en-GB"/>
-        </w:rPr>
-        <w:t>number_format</w:t>
-      </w:r>
-      <w:proofErr w:type="spellEnd"/>
-      <w:r>
-        <w:rPr>
-          <w:sz w:val="32"/>
-          <w:szCs w:val="32"/>
-          <w:lang w:val="en-GB"/>
-        </w:rPr>
-        <w:t>($total, 2, '.', '');</w:t>
+        <w:t xml:space="preserve">    return number_format($total, 2, '.', '');</w:t>
       </w:r>
       <w:r>
         <w:rPr>
@@ -21543,25 +20450,7 @@
           <w:szCs w:val="32"/>
           <w:lang w:val="en-GB"/>
         </w:rPr>
-        <w:t xml:space="preserve">public function </w:t>
-      </w:r>
-      <w:proofErr w:type="spellStart"/>
-      <w:r>
-        <w:rPr>
-          <w:sz w:val="32"/>
-          <w:szCs w:val="32"/>
-          <w:lang w:val="en-GB"/>
-        </w:rPr>
-        <w:t>getGrandTotalTtc</w:t>
-      </w:r>
-      <w:proofErr w:type="spellEnd"/>
-      <w:r>
-        <w:rPr>
-          <w:sz w:val="32"/>
-          <w:szCs w:val="32"/>
-          <w:lang w:val="en-GB"/>
-        </w:rPr>
-        <w:t>(): string</w:t>
+        <w:t>public function getGrandTotalTtc(): string</w:t>
       </w:r>
       <w:r>
         <w:rPr>
@@ -21596,52 +20485,16 @@
           <w:lang w:val="en-GB"/>
         </w:rPr>
         <w:br/>
-        <w:t xml:space="preserve">    foreach ($this-&gt;</w:t>
-      </w:r>
-      <w:proofErr w:type="spellStart"/>
+        <w:t xml:space="preserve">    foreach ($this-&gt;invoiceItems as $item) {</w:t>
+      </w:r>
       <w:r>
         <w:rPr>
           <w:sz w:val="32"/>
           <w:szCs w:val="32"/>
           <w:lang w:val="en-GB"/>
         </w:rPr>
-        <w:t>invoiceItems</w:t>
-      </w:r>
-      <w:proofErr w:type="spellEnd"/>
-      <w:r>
-        <w:rPr>
-          <w:sz w:val="32"/>
-          <w:szCs w:val="32"/>
-          <w:lang w:val="en-GB"/>
-        </w:rPr>
-        <w:t xml:space="preserve"> as $item) {</w:t>
-      </w:r>
-      <w:r>
-        <w:rPr>
-          <w:sz w:val="32"/>
-          <w:szCs w:val="32"/>
-          <w:lang w:val="en-GB"/>
-        </w:rPr>
         <w:br/>
-        <w:t xml:space="preserve">        $total += (float) $item-&gt;</w:t>
-      </w:r>
-      <w:proofErr w:type="spellStart"/>
-      <w:r>
-        <w:rPr>
-          <w:sz w:val="32"/>
-          <w:szCs w:val="32"/>
-          <w:lang w:val="en-GB"/>
-        </w:rPr>
-        <w:t>getTotalTtc</w:t>
-      </w:r>
-      <w:proofErr w:type="spellEnd"/>
-      <w:r>
-        <w:rPr>
-          <w:sz w:val="32"/>
-          <w:szCs w:val="32"/>
-          <w:lang w:val="en-GB"/>
-        </w:rPr>
-        <w:t>();</w:t>
+        <w:t xml:space="preserve">        $total += (float) $item-&gt;getTotalTtc();</w:t>
       </w:r>
       <w:r>
         <w:rPr>
@@ -21676,27 +20529,7 @@
           <w:highlight w:val="yellow"/>
           <w:lang w:val="en-GB"/>
         </w:rPr>
-        <w:t xml:space="preserve">return </w:t>
-      </w:r>
-      <w:proofErr w:type="spellStart"/>
-      <w:r>
-        <w:rPr>
-          <w:sz w:val="32"/>
-          <w:szCs w:val="32"/>
-          <w:highlight w:val="yellow"/>
-          <w:lang w:val="en-GB"/>
-        </w:rPr>
-        <w:t>number_format</w:t>
-      </w:r>
-      <w:proofErr w:type="spellEnd"/>
-      <w:r>
-        <w:rPr>
-          <w:sz w:val="32"/>
-          <w:szCs w:val="32"/>
-          <w:highlight w:val="yellow"/>
-          <w:lang w:val="en-GB"/>
-        </w:rPr>
-        <w:t>($total, 2, '.', '');</w:t>
+        <w:t>return number_format($total, 2, '.', '');</w:t>
       </w:r>
       <w:r>
         <w:rPr>
@@ -21779,61 +20612,15 @@
           <w:szCs w:val="40"/>
           <w:highlight w:val="yellow"/>
         </w:rPr>
-        <w:t>{{ (</w:t>
-      </w:r>
-      <w:proofErr w:type="spellStart"/>
-      <w:r>
-        <w:rPr>
-          <w:sz w:val="40"/>
-          <w:szCs w:val="40"/>
-          <w:highlight w:val="yellow"/>
-        </w:rPr>
-        <w:t>product.price</w:t>
-      </w:r>
-      <w:proofErr w:type="spellEnd"/>
-      <w:r>
-        <w:rPr>
-          <w:sz w:val="40"/>
-          <w:szCs w:val="40"/>
-          <w:highlight w:val="yellow"/>
-        </w:rPr>
-        <w:t xml:space="preserve"> * (1 + </w:t>
-      </w:r>
-      <w:proofErr w:type="spellStart"/>
-      <w:r>
-        <w:rPr>
-          <w:sz w:val="40"/>
-          <w:szCs w:val="40"/>
-          <w:highlight w:val="yellow"/>
-        </w:rPr>
-        <w:t>product.vatRate</w:t>
-      </w:r>
-      <w:proofErr w:type="spellEnd"/>
-      <w:r>
-        <w:rPr>
-          <w:sz w:val="40"/>
-          <w:szCs w:val="40"/>
-          <w:highlight w:val="yellow"/>
-        </w:rPr>
-        <w:t xml:space="preserve"> / 100))|</w:t>
-      </w:r>
-      <w:proofErr w:type="spellStart"/>
+        <w:t>{{ (product.price * (1 + product.vatRate / 100))|</w:t>
+      </w:r>
       <w:r>
         <w:rPr>
           <w:sz w:val="40"/>
           <w:szCs w:val="40"/>
           <w:highlight w:val="green"/>
         </w:rPr>
-        <w:t>number_format</w:t>
-      </w:r>
-      <w:proofErr w:type="spellEnd"/>
-      <w:r>
-        <w:rPr>
-          <w:sz w:val="40"/>
-          <w:szCs w:val="40"/>
-          <w:highlight w:val="green"/>
-        </w:rPr>
-        <w:t xml:space="preserve">(2, ',', ' ') }} </w:t>
+        <w:t xml:space="preserve">number_format(2, ',', ' ') }} </w:t>
       </w:r>
       <w:r>
         <w:rPr>
@@ -22039,7 +20826,6 @@
         </w:rPr>
         <w:t xml:space="preserve"> (appelé pipe), suivi du filtre </w:t>
       </w:r>
-      <w:proofErr w:type="spellStart"/>
       <w:r>
         <w:rPr>
           <w:rStyle w:val="CodeHTML"/>
@@ -22048,7 +20834,6 @@
         </w:rPr>
         <w:t>number_format</w:t>
       </w:r>
-      <w:proofErr w:type="spellEnd"/>
       <w:r>
         <w:rPr>
           <w:sz w:val="32"/>
@@ -22907,53 +21692,13 @@
           <w:highlight w:val="yellow"/>
           <w:lang w:val="en-GB"/>
         </w:rPr>
-        <w:t>-&gt;</w:t>
-      </w:r>
-      <w:proofErr w:type="spellStart"/>
+        <w:t xml:space="preserve">-&gt;setParameter("word$key", '%' . strtolower($word) . </w:t>
+      </w:r>
       <w:r>
         <w:rPr>
           <w:sz w:val="32"/>
           <w:szCs w:val="32"/>
           <w:highlight w:val="yellow"/>
-          <w:lang w:val="en-GB"/>
-        </w:rPr>
-        <w:t>setParameter</w:t>
-      </w:r>
-      <w:proofErr w:type="spellEnd"/>
-      <w:r>
-        <w:rPr>
-          <w:sz w:val="32"/>
-          <w:szCs w:val="32"/>
-          <w:highlight w:val="yellow"/>
-          <w:lang w:val="en-GB"/>
-        </w:rPr>
-        <w:t xml:space="preserve">("word$key", '%' . </w:t>
-      </w:r>
-      <w:proofErr w:type="spellStart"/>
-      <w:r>
-        <w:rPr>
-          <w:sz w:val="32"/>
-          <w:szCs w:val="32"/>
-          <w:highlight w:val="yellow"/>
-          <w:lang w:val="en-GB"/>
-        </w:rPr>
-        <w:t>strtolower</w:t>
-      </w:r>
-      <w:proofErr w:type="spellEnd"/>
-      <w:r>
-        <w:rPr>
-          <w:sz w:val="32"/>
-          <w:szCs w:val="32"/>
-          <w:highlight w:val="yellow"/>
-          <w:lang w:val="en-GB"/>
-        </w:rPr>
-        <w:t xml:space="preserve">($word) . </w:t>
-      </w:r>
-      <w:r>
-        <w:rPr>
-          <w:sz w:val="32"/>
-          <w:szCs w:val="32"/>
-          <w:highlight w:val="yellow"/>
         </w:rPr>
         <w:t>'%');</w:t>
       </w:r>
@@ -22980,7 +21725,21 @@
           <w:sz w:val="32"/>
           <w:szCs w:val="32"/>
         </w:rPr>
-        <w:t>ette technique permet d’effectuer une recherche multi-mots, insensible aux majuscules et minuscules.</w:t>
+        <w:t>ette technique permet d’effectuer une recherche multi-mots, insensible aux maj</w:t>
+      </w:r>
+      <w:r>
+        <w:rPr>
+          <w:sz w:val="32"/>
+          <w:szCs w:val="32"/>
+        </w:rPr>
+        <w:t>go</w:t>
+      </w:r>
+      <w:r>
+        <w:rPr>
+          <w:sz w:val="32"/>
+          <w:szCs w:val="32"/>
+        </w:rPr>
+        <w:t>uscules et minuscules.</w:t>
       </w:r>
     </w:p>
     <w:p>
@@ -23031,25 +21790,7 @@
           <w:highlight w:val="yellow"/>
         </w:rPr>
         <w:br/>
-        <w:t xml:space="preserve">   -&gt;</w:t>
-      </w:r>
-      <w:proofErr w:type="spellStart"/>
-      <w:r>
-        <w:rPr>
-          <w:sz w:val="32"/>
-          <w:szCs w:val="32"/>
-          <w:highlight w:val="yellow"/>
-        </w:rPr>
-        <w:t>setParameter</w:t>
-      </w:r>
-      <w:proofErr w:type="spellEnd"/>
-      <w:r>
-        <w:rPr>
-          <w:sz w:val="32"/>
-          <w:szCs w:val="32"/>
-          <w:highlight w:val="yellow"/>
-        </w:rPr>
-        <w:t>('brand', $brand);</w:t>
+        <w:t xml:space="preserve">   -&gt;setParameter('brand', $brand);</w:t>
       </w:r>
     </w:p>
     <w:p>
@@ -23114,25 +21855,7 @@
           <w:highlight w:val="yellow"/>
         </w:rPr>
         <w:br/>
-        <w:t xml:space="preserve">    -&gt;</w:t>
-      </w:r>
-      <w:proofErr w:type="spellStart"/>
-      <w:r>
-        <w:rPr>
-          <w:sz w:val="32"/>
-          <w:szCs w:val="32"/>
-          <w:highlight w:val="yellow"/>
-        </w:rPr>
-        <w:t>addOrderBy</w:t>
-      </w:r>
-      <w:proofErr w:type="spellEnd"/>
-      <w:r>
-        <w:rPr>
-          <w:sz w:val="32"/>
-          <w:szCs w:val="32"/>
-          <w:highlight w:val="yellow"/>
-        </w:rPr>
-        <w:t>('p.brand', 'ASC');</w:t>
+        <w:t xml:space="preserve">    -&gt;addOrderBy('p.brand', 'ASC');</w:t>
       </w:r>
     </w:p>
     <w:p>
@@ -23193,7 +21916,6 @@
         </w:rPr>
         <w:t xml:space="preserve">L’utilisation de </w:t>
       </w:r>
-      <w:proofErr w:type="spellStart"/>
       <w:r>
         <w:rPr>
           <w:b/>
@@ -23203,27 +21925,12 @@
         </w:rPr>
         <w:t>Gotenberg</w:t>
       </w:r>
-      <w:proofErr w:type="spellEnd"/>
-      <w:r>
-        <w:rPr>
-          <w:sz w:val="32"/>
-          <w:szCs w:val="32"/>
-        </w:rPr>
-        <w:t xml:space="preserve"> permet de générer les factures PDF côté serveur à partir d’un </w:t>
-      </w:r>
-      <w:r>
-        <w:rPr>
-          <w:sz w:val="32"/>
-          <w:szCs w:val="32"/>
-        </w:rPr>
-        <w:t>Template</w:t>
-      </w:r>
-      <w:r>
-        <w:rPr>
-          <w:sz w:val="32"/>
-          <w:szCs w:val="32"/>
-        </w:rPr>
-        <w:t xml:space="preserve"> HTML/Twig. Contrairement à l’impression navigateur, cette solution garantit un rendu maîtrisé, sans dépendre des paramètres d’impression de l’utilisateur.</w:t>
+      <w:r>
+        <w:rPr>
+          <w:sz w:val="32"/>
+          <w:szCs w:val="32"/>
+        </w:rPr>
+        <w:t xml:space="preserve"> permet de générer les factures PDF côté serveur à partir d’un Template HTML/Twig. Contrairement à l’impression navigateur, cette solution garantit un rendu maîtrisé, sans dépendre des paramètres d’impression de l’utilisateur.</w:t>
       </w:r>
     </w:p>
     <w:p>
@@ -23280,19 +21987,8 @@
           <w:sz w:val="32"/>
           <w:szCs w:val="32"/>
         </w:rPr>
-        <w:t xml:space="preserve">SensioLabs </w:t>
-      </w:r>
-      <w:proofErr w:type="spellStart"/>
-      <w:r>
-        <w:rPr>
-          <w:b/>
-          <w:bCs/>
-          <w:sz w:val="32"/>
-          <w:szCs w:val="32"/>
-        </w:rPr>
-        <w:t>GotenbergBundle</w:t>
-      </w:r>
-      <w:proofErr w:type="spellEnd"/>
+        <w:t>SensioLabs GotenbergBundle</w:t>
+      </w:r>
     </w:p>
     <w:p>
       <w:pPr>
@@ -23333,51 +22029,7 @@
           <w:szCs w:val="32"/>
           <w:highlight w:val="yellow"/>
         </w:rPr>
-        <w:t xml:space="preserve">composer require </w:t>
-      </w:r>
-      <w:proofErr w:type="spellStart"/>
-      <w:r>
-        <w:rPr>
-          <w:b/>
-          <w:bCs/>
-          <w:sz w:val="32"/>
-          <w:szCs w:val="32"/>
-          <w:highlight w:val="yellow"/>
-        </w:rPr>
-        <w:t>gotenberg</w:t>
-      </w:r>
-      <w:proofErr w:type="spellEnd"/>
-      <w:r>
-        <w:rPr>
-          <w:b/>
-          <w:bCs/>
-          <w:sz w:val="32"/>
-          <w:szCs w:val="32"/>
-          <w:highlight w:val="yellow"/>
-        </w:rPr>
-        <w:t>/</w:t>
-      </w:r>
-      <w:proofErr w:type="spellStart"/>
-      <w:r>
-        <w:rPr>
-          <w:b/>
-          <w:bCs/>
-          <w:sz w:val="32"/>
-          <w:szCs w:val="32"/>
-          <w:highlight w:val="yellow"/>
-        </w:rPr>
-        <w:t>gotenberg</w:t>
-      </w:r>
-      <w:proofErr w:type="spellEnd"/>
-      <w:r>
-        <w:rPr>
-          <w:b/>
-          <w:bCs/>
-          <w:sz w:val="32"/>
-          <w:szCs w:val="32"/>
-          <w:highlight w:val="yellow"/>
-        </w:rPr>
-        <w:t>-php</w:t>
+        <w:t>composer require gotenberg/gotenberg-php</w:t>
       </w:r>
     </w:p>
     <w:p>
@@ -23406,11 +22058,72 @@
     </w:p>
     <w:p>
       <w:pPr>
+        <w:pStyle w:val="Titre2"/>
+      </w:pPr>
+      <w:r>
+        <w:lastRenderedPageBreak/>
+        <w:t>Installation de l’API Gotenberg qui est une API</w:t>
+      </w:r>
+    </w:p>
+    <w:p>
+      <w:pPr>
+        <w:pStyle w:val="Paragraphedeliste"/>
+        <w:numPr>
+          <w:ilvl w:val="0"/>
+          <w:numId w:val="17"/>
+        </w:numPr>
         <w:rPr>
           <w:sz w:val="40"/>
           <w:szCs w:val="40"/>
         </w:rPr>
       </w:pPr>
+      <w:r>
+        <w:rPr>
+          <w:sz w:val="40"/>
+          <w:szCs w:val="40"/>
+        </w:rPr>
+        <w:t>Télécharger Docker</w:t>
+      </w:r>
+    </w:p>
+    <w:p>
+      <w:pPr>
+        <w:pStyle w:val="Paragraphedeliste"/>
+        <w:numPr>
+          <w:ilvl w:val="0"/>
+          <w:numId w:val="17"/>
+        </w:numPr>
+        <w:rPr>
+          <w:sz w:val="40"/>
+          <w:szCs w:val="40"/>
+        </w:rPr>
+      </w:pPr>
+      <w:r>
+        <w:rPr>
+          <w:sz w:val="40"/>
+          <w:szCs w:val="40"/>
+        </w:rPr>
+        <w:t>installer wsl a la demande de docker</w:t>
+      </w:r>
+    </w:p>
+    <w:p>
+      <w:pPr>
+        <w:pStyle w:val="Paragraphedeliste"/>
+        <w:numPr>
+          <w:ilvl w:val="0"/>
+          <w:numId w:val="17"/>
+        </w:numPr>
+        <w:rPr>
+          <w:sz w:val="40"/>
+          <w:szCs w:val="40"/>
+        </w:rPr>
+      </w:pPr>
+      <w:r>
+        <w:rPr>
+          <w:sz w:val="40"/>
+          <w:szCs w:val="40"/>
+        </w:rPr>
+        <w:t xml:space="preserve">installer gotenberg via composer dans le terminal </w:t>
+      </w:r>
     </w:p>
     <w:p>
       <w:pPr>
@@ -23574,7 +22287,6 @@
       </w:pPr>
       <w:bookmarkStart w:id="29" w:name="_Toc227941645"/>
       <w:r>
-        <w:lastRenderedPageBreak/>
         <w:t>Glossaire technique</w:t>
       </w:r>
       <w:bookmarkEnd w:id="29"/>
@@ -23640,15 +22352,7 @@
         <w:t>Twig</w:t>
       </w:r>
       <w:r>
-        <w:t xml:space="preserve"> : moteur de </w:t>
-      </w:r>
-      <w:proofErr w:type="spellStart"/>
-      <w:r>
-        <w:t>template</w:t>
-      </w:r>
-      <w:proofErr w:type="spellEnd"/>
-      <w:r>
-        <w:t xml:space="preserve"> utilisé pour l’affichage </w:t>
+        <w:t xml:space="preserve"> : moteur de template utilisé pour l’affichage </w:t>
       </w:r>
     </w:p>
     <w:p/>
@@ -25338,6 +24042,92 @@
     </w:lvl>
   </w:abstractNum>
   <w:abstractNum w:abstractNumId="11" w15:restartNumberingAfterBreak="0">
+    <w:nsid w:val="3EA86AB5"/>
+    <w:multiLevelType w:val="hybridMultilevel"/>
+    <w:tmpl w:val="050042DA"/>
+    <w:lvl w:ilvl="0" w:tplc="040C000F">
+      <w:start w:val="1"/>
+      <w:numFmt w:val="decimal"/>
+      <w:lvlText w:val="%1."/>
+      <w:lvlJc w:val="left"/>
+      <w:pPr>
+        <w:ind w:left="806" w:hanging="360"/>
+      </w:pPr>
+    </w:lvl>
+    <w:lvl w:ilvl="1" w:tplc="040C0019" w:tentative="1">
+      <w:start w:val="1"/>
+      <w:numFmt w:val="lowerLetter"/>
+      <w:lvlText w:val="%2."/>
+      <w:lvlJc w:val="left"/>
+      <w:pPr>
+        <w:ind w:left="1526" w:hanging="360"/>
+      </w:pPr>
+    </w:lvl>
+    <w:lvl w:ilvl="2" w:tplc="040C001B" w:tentative="1">
+      <w:start w:val="1"/>
+      <w:numFmt w:val="lowerRoman"/>
+      <w:lvlText w:val="%3."/>
+      <w:lvlJc w:val="right"/>
+      <w:pPr>
+        <w:ind w:left="2246" w:hanging="180"/>
+      </w:pPr>
+    </w:lvl>
+    <w:lvl w:ilvl="3" w:tplc="040C000F" w:tentative="1">
+      <w:start w:val="1"/>
+      <w:numFmt w:val="decimal"/>
+      <w:lvlText w:val="%4."/>
+      <w:lvlJc w:val="left"/>
+      <w:pPr>
+        <w:ind w:left="2966" w:hanging="360"/>
+      </w:pPr>
+    </w:lvl>
+    <w:lvl w:ilvl="4" w:tplc="040C0019" w:tentative="1">
+      <w:start w:val="1"/>
+      <w:numFmt w:val="lowerLetter"/>
+      <w:lvlText w:val="%5."/>
+      <w:lvlJc w:val="left"/>
+      <w:pPr>
+        <w:ind w:left="3686" w:hanging="360"/>
+      </w:pPr>
+    </w:lvl>
+    <w:lvl w:ilvl="5" w:tplc="040C001B" w:tentative="1">
+      <w:start w:val="1"/>
+      <w:numFmt w:val="lowerRoman"/>
+      <w:lvlText w:val="%6."/>
+      <w:lvlJc w:val="right"/>
+      <w:pPr>
+        <w:ind w:left="4406" w:hanging="180"/>
+      </w:pPr>
+    </w:lvl>
+    <w:lvl w:ilvl="6" w:tplc="040C000F" w:tentative="1">
+      <w:start w:val="1"/>
+      <w:numFmt w:val="decimal"/>
+      <w:lvlText w:val="%7."/>
+      <w:lvlJc w:val="left"/>
+      <w:pPr>
+        <w:ind w:left="5126" w:hanging="360"/>
+      </w:pPr>
+    </w:lvl>
+    <w:lvl w:ilvl="7" w:tplc="040C0019" w:tentative="1">
+      <w:start w:val="1"/>
+      <w:numFmt w:val="lowerLetter"/>
+      <w:lvlText w:val="%8."/>
+      <w:lvlJc w:val="left"/>
+      <w:pPr>
+        <w:ind w:left="5846" w:hanging="360"/>
+      </w:pPr>
+    </w:lvl>
+    <w:lvl w:ilvl="8" w:tplc="040C001B" w:tentative="1">
+      <w:start w:val="1"/>
+      <w:numFmt w:val="lowerRoman"/>
+      <w:lvlText w:val="%9."/>
+      <w:lvlJc w:val="right"/>
+      <w:pPr>
+        <w:ind w:left="6566" w:hanging="180"/>
+      </w:pPr>
+    </w:lvl>
+  </w:abstractNum>
+  <w:abstractNum w:abstractNumId="12" w15:restartNumberingAfterBreak="0">
     <w:nsid w:val="45150146"/>
     <w:multiLevelType w:val="multilevel"/>
     <w:tmpl w:val="F348BC24"/>
@@ -25486,7 +24276,7 @@
       </w:rPr>
     </w:lvl>
   </w:abstractNum>
-  <w:abstractNum w:abstractNumId="12" w15:restartNumberingAfterBreak="0">
+  <w:abstractNum w:abstractNumId="13" w15:restartNumberingAfterBreak="0">
     <w:nsid w:val="56287F51"/>
     <w:multiLevelType w:val="multilevel"/>
     <w:tmpl w:val="25661C2E"/>
@@ -25635,7 +24425,7 @@
       </w:rPr>
     </w:lvl>
   </w:abstractNum>
-  <w:abstractNum w:abstractNumId="13" w15:restartNumberingAfterBreak="0">
+  <w:abstractNum w:abstractNumId="14" w15:restartNumberingAfterBreak="0">
     <w:nsid w:val="6271456B"/>
     <w:multiLevelType w:val="multilevel"/>
     <w:tmpl w:val="A03C970A"/>
@@ -25784,7 +24574,7 @@
       </w:rPr>
     </w:lvl>
   </w:abstractNum>
-  <w:abstractNum w:abstractNumId="14" w15:restartNumberingAfterBreak="0">
+  <w:abstractNum w:abstractNumId="15" w15:restartNumberingAfterBreak="0">
     <w:nsid w:val="700C3CEA"/>
     <w:multiLevelType w:val="multilevel"/>
     <w:tmpl w:val="2AD48AB2"/>
@@ -25933,7 +24723,7 @@
       </w:rPr>
     </w:lvl>
   </w:abstractNum>
-  <w:abstractNum w:abstractNumId="15" w15:restartNumberingAfterBreak="0">
+  <w:abstractNum w:abstractNumId="16" w15:restartNumberingAfterBreak="0">
     <w:nsid w:val="7497253F"/>
     <w:multiLevelType w:val="multilevel"/>
     <w:tmpl w:val="164CD772"/>
@@ -26086,7 +24876,7 @@
     <w:abstractNumId w:val="6"/>
   </w:num>
   <w:num w:numId="2" w16cid:durableId="788279594">
-    <w:abstractNumId w:val="11"/>
+    <w:abstractNumId w:val="12"/>
   </w:num>
   <w:num w:numId="3" w16cid:durableId="192885476">
     <w:abstractNumId w:val="5"/>
@@ -26107,19 +24897,19 @@
     <w:abstractNumId w:val="2"/>
   </w:num>
   <w:num w:numId="9" w16cid:durableId="1225338985">
-    <w:abstractNumId w:val="12"/>
+    <w:abstractNumId w:val="13"/>
   </w:num>
   <w:num w:numId="10" w16cid:durableId="1830441398">
-    <w:abstractNumId w:val="15"/>
+    <w:abstractNumId w:val="16"/>
   </w:num>
   <w:num w:numId="11" w16cid:durableId="2040163789">
     <w:abstractNumId w:val="4"/>
   </w:num>
   <w:num w:numId="12" w16cid:durableId="1013533006">
-    <w:abstractNumId w:val="14"/>
+    <w:abstractNumId w:val="15"/>
   </w:num>
   <w:num w:numId="13" w16cid:durableId="1759863322">
-    <w:abstractNumId w:val="13"/>
+    <w:abstractNumId w:val="14"/>
   </w:num>
   <w:num w:numId="14" w16cid:durableId="733432097">
     <w:abstractNumId w:val="10"/>
@@ -26129,6 +24919,9 @@
   </w:num>
   <w:num w:numId="16" w16cid:durableId="169754870">
     <w:abstractNumId w:val="7"/>
+  </w:num>
+  <w:num w:numId="17" w16cid:durableId="1123185859">
+    <w:abstractNumId w:val="11"/>
   </w:num>
 </w:numbering>
 </file>
@@ -26735,6 +25528,7 @@
   <w:style w:type="character" w:default="1" w:styleId="Policepardfaut">
     <w:name w:val="Default Paragraph Font"/>
     <w:uiPriority w:val="1"/>
+    <w:semiHidden/>
     <w:unhideWhenUsed/>
   </w:style>
   <w:style w:type="table" w:default="1" w:styleId="TableauNormal">

</xml_diff>

<commit_message>
update graphic ux login,home,index
</commit_message>
<xml_diff>
--- a/documentation/dossier minifacturier.docx
+++ b/documentation/dossier minifacturier.docx
@@ -21947,6 +21947,46 @@
           <w:highlight w:val="yellow"/>
         </w:rPr>
         <w:t>{% for product in products %}</w:t>
+      </w:r>
+    </w:p>
+    <w:p>
+      <w:pPr>
+        <w:rPr>
+          <w:sz w:val="32"/>
+          <w:szCs w:val="32"/>
+        </w:rPr>
+      </w:pPr>
+      <w:r>
+        <w:rPr>
+          <w:b/>
+          <w:bCs/>
+          <w:sz w:val="32"/>
+          <w:szCs w:val="32"/>
+          <w:u w:val="single"/>
+        </w:rPr>
+        <w:t>Evolution prévue du catalogue</w:t>
+      </w:r>
+      <w:r>
+        <w:rPr>
+          <w:sz w:val="32"/>
+          <w:szCs w:val="32"/>
+        </w:rPr>
+        <w:t> :</w:t>
+      </w:r>
+    </w:p>
+    <w:p>
+      <w:pPr>
+        <w:rPr>
+          <w:sz w:val="32"/>
+          <w:szCs w:val="32"/>
+        </w:rPr>
+      </w:pPr>
+      <w:r>
+        <w:rPr>
+          <w:sz w:val="32"/>
+          <w:szCs w:val="32"/>
+        </w:rPr>
+        <w:t>Une amélioration prévue est d’ajouter des images aux produits pour rendre le catalogue plus visuel et améliorer l’expérience utilisateur</w:t>
       </w:r>
     </w:p>
     <w:p>
@@ -35108,7 +35148,6 @@
   <w:style w:type="character" w:default="1" w:styleId="Policepardfaut">
     <w:name w:val="Default Paragraph Font"/>
     <w:uiPriority w:val="1"/>
-    <w:semiHidden/>
     <w:unhideWhenUsed/>
   </w:style>
   <w:style w:type="table" w:default="1" w:styleId="TableauNormal">

</xml_diff>

<commit_message>
fix call adress mailpit in modal
</commit_message>
<xml_diff>
--- a/documentation/dossier minifacturier.docx
+++ b/documentation/dossier minifacturier.docx
@@ -17663,21 +17663,14 @@
       </w:pPr>
       <w:r>
         <w:rPr>
-          <w:noProof/>
+          <w:sz w:val="32"/>
+          <w:szCs w:val="32"/>
         </w:rPr>
         <w:drawing>
-          <wp:anchor distT="0" distB="0" distL="114300" distR="114300" simplePos="0" relativeHeight="251729408" behindDoc="1" locked="0" layoutInCell="1" allowOverlap="1" wp14:anchorId="2B8627BF" wp14:editId="6BC87CA6">
-            <wp:simplePos x="0" y="0"/>
-            <wp:positionH relativeFrom="margin">
-              <wp:align>left</wp:align>
-            </wp:positionH>
-            <wp:positionV relativeFrom="paragraph">
-              <wp:posOffset>6985</wp:posOffset>
-            </wp:positionV>
-            <wp:extent cx="5760085" cy="4178300"/>
+          <wp:inline distT="0" distB="0" distL="0" distR="0" wp14:anchorId="7E47B76F" wp14:editId="6CFF9039">
+            <wp:extent cx="5760085" cy="2916555"/>
             <wp:effectExtent l="0" t="0" r="0" b="0"/>
-            <wp:wrapNone/>
-            <wp:docPr id="1309300277" name="Image 1"/>
+            <wp:docPr id="2107691350" name="Image 1"/>
             <wp:cNvGraphicFramePr>
               <a:graphicFrameLocks xmlns:a="http://schemas.openxmlformats.org/drawingml/2006/main" noChangeAspect="1"/>
             </wp:cNvGraphicFramePr>
@@ -17685,17 +17678,11 @@
               <a:graphicData uri="http://schemas.openxmlformats.org/drawingml/2006/picture">
                 <pic:pic xmlns:pic="http://schemas.openxmlformats.org/drawingml/2006/picture">
                   <pic:nvPicPr>
-                    <pic:cNvPr id="1309300277" name=""/>
+                    <pic:cNvPr id="2107691350" name=""/>
                     <pic:cNvPicPr/>
                   </pic:nvPicPr>
                   <pic:blipFill>
-                    <a:blip r:embed="rId18">
-                      <a:extLst>
-                        <a:ext uri="{28A0092B-C50C-407E-A947-70E740481C1C}">
-                          <a14:useLocalDpi xmlns:a14="http://schemas.microsoft.com/office/drawing/2010/main" val="0"/>
-                        </a:ext>
-                      </a:extLst>
-                    </a:blip>
+                    <a:blip r:embed="rId18"/>
                     <a:stretch>
                       <a:fillRect/>
                     </a:stretch>
@@ -17703,7 +17690,7 @@
                   <pic:spPr>
                     <a:xfrm>
                       <a:off x="0" y="0"/>
-                      <a:ext cx="5760085" cy="4178300"/>
+                      <a:ext cx="5760085" cy="2916555"/>
                     </a:xfrm>
                     <a:prstGeom prst="rect">
                       <a:avLst/>
@@ -17712,92 +17699,9 @@
                 </pic:pic>
               </a:graphicData>
             </a:graphic>
-            <wp14:sizeRelV relativeFrom="margin">
-              <wp14:pctHeight>0</wp14:pctHeight>
-            </wp14:sizeRelV>
-          </wp:anchor>
+          </wp:inline>
         </w:drawing>
       </w:r>
-    </w:p>
-    <w:p>
-      <w:pPr>
-        <w:rPr>
-          <w:sz w:val="32"/>
-          <w:szCs w:val="32"/>
-        </w:rPr>
-      </w:pPr>
-    </w:p>
-    <w:p>
-      <w:pPr>
-        <w:rPr>
-          <w:sz w:val="32"/>
-          <w:szCs w:val="32"/>
-        </w:rPr>
-      </w:pPr>
-    </w:p>
-    <w:p>
-      <w:pPr>
-        <w:rPr>
-          <w:sz w:val="32"/>
-          <w:szCs w:val="32"/>
-        </w:rPr>
-      </w:pPr>
-    </w:p>
-    <w:p>
-      <w:pPr>
-        <w:rPr>
-          <w:sz w:val="32"/>
-          <w:szCs w:val="32"/>
-        </w:rPr>
-      </w:pPr>
-    </w:p>
-    <w:p>
-      <w:pPr>
-        <w:rPr>
-          <w:sz w:val="32"/>
-          <w:szCs w:val="32"/>
-        </w:rPr>
-      </w:pPr>
-    </w:p>
-    <w:p>
-      <w:pPr>
-        <w:rPr>
-          <w:sz w:val="32"/>
-          <w:szCs w:val="32"/>
-        </w:rPr>
-      </w:pPr>
-    </w:p>
-    <w:p>
-      <w:pPr>
-        <w:rPr>
-          <w:sz w:val="32"/>
-          <w:szCs w:val="32"/>
-        </w:rPr>
-      </w:pPr>
-    </w:p>
-    <w:p>
-      <w:pPr>
-        <w:rPr>
-          <w:sz w:val="32"/>
-          <w:szCs w:val="32"/>
-        </w:rPr>
-      </w:pPr>
-    </w:p>
-    <w:p>
-      <w:pPr>
-        <w:rPr>
-          <w:sz w:val="32"/>
-          <w:szCs w:val="32"/>
-        </w:rPr>
-      </w:pPr>
-    </w:p>
-    <w:p>
-      <w:pPr>
-        <w:rPr>
-          <w:sz w:val="32"/>
-          <w:szCs w:val="32"/>
-        </w:rPr>
-      </w:pPr>
     </w:p>
     <w:p>
       <w:pPr>
@@ -17963,6 +17867,22 @@
     </w:p>
     <w:p>
       <w:pPr>
+        <w:rPr>
+          <w:sz w:val="32"/>
+          <w:szCs w:val="32"/>
+        </w:rPr>
+      </w:pPr>
+    </w:p>
+    <w:p>
+      <w:pPr>
+        <w:rPr>
+          <w:sz w:val="32"/>
+          <w:szCs w:val="32"/>
+        </w:rPr>
+      </w:pPr>
+    </w:p>
+    <w:p>
+      <w:pPr>
         <w:pStyle w:val="Sous-titre"/>
       </w:pPr>
       <w:r>
@@ -17971,6 +17891,7 @@
           <w:sz w:val="32"/>
           <w:szCs w:val="32"/>
         </w:rPr>
+        <w:lastRenderedPageBreak/>
         <w:drawing>
           <wp:anchor distT="0" distB="0" distL="114300" distR="114300" simplePos="0" relativeHeight="251702784" behindDoc="1" locked="0" layoutInCell="1" allowOverlap="1" wp14:anchorId="6FA0DF78" wp14:editId="73BB487E">
             <wp:simplePos x="0" y="0"/>
@@ -18278,23 +18199,23 @@
           <w:sz w:val="32"/>
           <w:szCs w:val="32"/>
         </w:rPr>
+        <w:t>Modal de confirmation de l’envoie du message</w:t>
+      </w:r>
+    </w:p>
+    <w:p>
+      <w:pPr>
+        <w:rPr>
+          <w:sz w:val="32"/>
+          <w:szCs w:val="32"/>
+        </w:rPr>
+      </w:pPr>
+      <w:r>
+        <w:rPr>
+          <w:noProof/>
+          <w:sz w:val="32"/>
+          <w:szCs w:val="32"/>
+        </w:rPr>
         <w:lastRenderedPageBreak/>
-        <w:t>Modal de confirmation de l’envoie du message</w:t>
-      </w:r>
-    </w:p>
-    <w:p>
-      <w:pPr>
-        <w:rPr>
-          <w:sz w:val="32"/>
-          <w:szCs w:val="32"/>
-        </w:rPr>
-      </w:pPr>
-      <w:r>
-        <w:rPr>
-          <w:noProof/>
-          <w:sz w:val="32"/>
-          <w:szCs w:val="32"/>
-        </w:rPr>
         <w:drawing>
           <wp:inline distT="0" distB="0" distL="0" distR="0" wp14:anchorId="3C041B7A" wp14:editId="1B7B61DB">
             <wp:extent cx="5760085" cy="3191510"/>
@@ -18491,23 +18412,22 @@
       </w:pPr>
       <w:r>
         <w:rPr>
-          <w:noProof/>
           <w:sz w:val="32"/>
           <w:szCs w:val="32"/>
         </w:rPr>
         <w:drawing>
-          <wp:anchor distT="0" distB="0" distL="114300" distR="114300" simplePos="0" relativeHeight="251704832" behindDoc="1" locked="0" layoutInCell="1" allowOverlap="1" wp14:anchorId="35DF1676" wp14:editId="1F3A5EBB">
+          <wp:anchor distT="0" distB="0" distL="114300" distR="114300" simplePos="0" relativeHeight="251730432" behindDoc="1" locked="0" layoutInCell="1" allowOverlap="1" wp14:anchorId="3577696B" wp14:editId="723505CD">
             <wp:simplePos x="0" y="0"/>
-            <wp:positionH relativeFrom="margin">
-              <wp:posOffset>65314</wp:posOffset>
+            <wp:positionH relativeFrom="column">
+              <wp:posOffset>1270</wp:posOffset>
             </wp:positionH>
             <wp:positionV relativeFrom="paragraph">
-              <wp:posOffset>14605</wp:posOffset>
+              <wp:posOffset>-635</wp:posOffset>
             </wp:positionV>
-            <wp:extent cx="5760085" cy="4330700"/>
-            <wp:effectExtent l="0" t="0" r="0" b="0"/>
+            <wp:extent cx="5760085" cy="3782060"/>
+            <wp:effectExtent l="0" t="0" r="0" b="8890"/>
             <wp:wrapNone/>
-            <wp:docPr id="1064510759" name="Image 1"/>
+            <wp:docPr id="1929343052" name="Image 1"/>
             <wp:cNvGraphicFramePr>
               <a:graphicFrameLocks xmlns:a="http://schemas.openxmlformats.org/drawingml/2006/main" noChangeAspect="1"/>
             </wp:cNvGraphicFramePr>
@@ -18515,11 +18435,11 @@
               <a:graphicData uri="http://schemas.openxmlformats.org/drawingml/2006/picture">
                 <pic:pic xmlns:pic="http://schemas.openxmlformats.org/drawingml/2006/picture">
                   <pic:nvPicPr>
-                    <pic:cNvPr id="1064510759" name=""/>
+                    <pic:cNvPr id="1929343052" name=""/>
                     <pic:cNvPicPr/>
                   </pic:nvPicPr>
                   <pic:blipFill>
-                    <a:blip r:embed="rId24">
+                    <a:blip r:embed="rId24" cstate="print">
                       <a:extLst>
                         <a:ext uri="{28A0092B-C50C-407E-A947-70E740481C1C}">
                           <a14:useLocalDpi xmlns:a14="http://schemas.microsoft.com/office/drawing/2010/main" val="0"/>
@@ -18533,7 +18453,7 @@
                   <pic:spPr>
                     <a:xfrm>
                       <a:off x="0" y="0"/>
-                      <a:ext cx="5760085" cy="4330700"/>
+                      <a:ext cx="5760085" cy="3782060"/>
                     </a:xfrm>
                     <a:prstGeom prst="rect">
                       <a:avLst/>
@@ -18625,36 +18545,19 @@
       <w:bookmarkStart w:id="18" w:name="_Toc228464229"/>
       <w:r>
         <w:lastRenderedPageBreak/>
-        <w:t>Dashboard Sellers</w:t>
-      </w:r>
-      <w:bookmarkEnd w:id="18"/>
-    </w:p>
-    <w:p>
-      <w:pPr>
-        <w:rPr>
-          <w:sz w:val="32"/>
-          <w:szCs w:val="32"/>
-        </w:rPr>
-      </w:pPr>
-      <w:r>
-        <w:rPr>
-          <w:noProof/>
-          <w:sz w:val="32"/>
-          <w:szCs w:val="32"/>
-        </w:rPr>
         <w:drawing>
-          <wp:anchor distT="0" distB="0" distL="114300" distR="114300" simplePos="0" relativeHeight="251705856" behindDoc="1" locked="0" layoutInCell="1" allowOverlap="1" wp14:anchorId="59DE58FF" wp14:editId="1C0477CC">
+          <wp:anchor distT="0" distB="0" distL="114300" distR="114300" simplePos="0" relativeHeight="251731456" behindDoc="1" locked="0" layoutInCell="1" allowOverlap="1" wp14:anchorId="7A5017C0" wp14:editId="28B6523D">
             <wp:simplePos x="0" y="0"/>
             <wp:positionH relativeFrom="margin">
-              <wp:align>right</wp:align>
+              <wp:align>left</wp:align>
             </wp:positionH>
             <wp:positionV relativeFrom="paragraph">
-              <wp:posOffset>15240</wp:posOffset>
+              <wp:posOffset>-2540</wp:posOffset>
             </wp:positionV>
-            <wp:extent cx="5760085" cy="4511675"/>
-            <wp:effectExtent l="0" t="0" r="0" b="3175"/>
+            <wp:extent cx="5760085" cy="4216400"/>
+            <wp:effectExtent l="0" t="0" r="0" b="0"/>
             <wp:wrapNone/>
-            <wp:docPr id="1879028024" name="Image 1"/>
+            <wp:docPr id="1497994818" name="Image 1"/>
             <wp:cNvGraphicFramePr>
               <a:graphicFrameLocks xmlns:a="http://schemas.openxmlformats.org/drawingml/2006/main" noChangeAspect="1"/>
             </wp:cNvGraphicFramePr>
@@ -18662,11 +18565,11 @@
               <a:graphicData uri="http://schemas.openxmlformats.org/drawingml/2006/picture">
                 <pic:pic xmlns:pic="http://schemas.openxmlformats.org/drawingml/2006/picture">
                   <pic:nvPicPr>
-                    <pic:cNvPr id="1879028024" name=""/>
+                    <pic:cNvPr id="1497994818" name=""/>
                     <pic:cNvPicPr/>
                   </pic:nvPicPr>
                   <pic:blipFill>
-                    <a:blip r:embed="rId25">
+                    <a:blip r:embed="rId25" cstate="print">
                       <a:extLst>
                         <a:ext uri="{28A0092B-C50C-407E-A947-70E740481C1C}">
                           <a14:useLocalDpi xmlns:a14="http://schemas.microsoft.com/office/drawing/2010/main" val="0"/>
@@ -18680,7 +18583,7 @@
                   <pic:spPr>
                     <a:xfrm>
                       <a:off x="0" y="0"/>
-                      <a:ext cx="5760085" cy="4511675"/>
+                      <a:ext cx="5760085" cy="4216400"/>
                     </a:xfrm>
                     <a:prstGeom prst="rect">
                       <a:avLst/>
@@ -18689,9 +18592,16 @@
                 </pic:pic>
               </a:graphicData>
             </a:graphic>
+            <wp14:sizeRelV relativeFrom="margin">
+              <wp14:pctHeight>0</wp14:pctHeight>
+            </wp14:sizeRelV>
           </wp:anchor>
         </w:drawing>
       </w:r>
+      <w:r>
+        <w:t>Dashboard Sellers</w:t>
+      </w:r>
+      <w:bookmarkEnd w:id="18"/>
     </w:p>
     <w:p>
       <w:pPr>
@@ -18847,24 +18757,36 @@
       </w:pPr>
       <w:bookmarkStart w:id="19" w:name="_Toc228464230"/>
       <w:r>
+        <w:t>Liste des clients avec le paginator</w:t>
+      </w:r>
+      <w:bookmarkEnd w:id="19"/>
+      <w:r>
+        <w:t xml:space="preserve"> </w:t>
+      </w:r>
+    </w:p>
+    <w:p>
+      <w:pPr>
         <w:rPr>
           <w:b/>
           <w:bCs/>
-          <w:noProof/>
-        </w:rPr>
+          <w:sz w:val="32"/>
+          <w:szCs w:val="32"/>
+        </w:rPr>
+      </w:pPr>
+      <w:r>
         <w:drawing>
-          <wp:anchor distT="0" distB="0" distL="114300" distR="114300" simplePos="0" relativeHeight="251706880" behindDoc="1" locked="0" layoutInCell="1" allowOverlap="1" wp14:anchorId="05899FDB" wp14:editId="442705C5">
+          <wp:anchor distT="0" distB="0" distL="114300" distR="114300" simplePos="0" relativeHeight="251732480" behindDoc="1" locked="0" layoutInCell="1" allowOverlap="1" wp14:anchorId="0EF33D42" wp14:editId="219F78C4">
             <wp:simplePos x="0" y="0"/>
-            <wp:positionH relativeFrom="margin">
-              <wp:posOffset>-356143</wp:posOffset>
+            <wp:positionH relativeFrom="column">
+              <wp:posOffset>128270</wp:posOffset>
             </wp:positionH>
             <wp:positionV relativeFrom="paragraph">
-              <wp:posOffset>352697</wp:posOffset>
+              <wp:posOffset>15240</wp:posOffset>
             </wp:positionV>
-            <wp:extent cx="5822952" cy="3455035"/>
-            <wp:effectExtent l="0" t="0" r="6350" b="0"/>
+            <wp:extent cx="5760085" cy="3797935"/>
+            <wp:effectExtent l="0" t="0" r="0" b="0"/>
             <wp:wrapNone/>
-            <wp:docPr id="839023660" name="Image 1"/>
+            <wp:docPr id="1690896393" name="Image 1"/>
             <wp:cNvGraphicFramePr>
               <a:graphicFrameLocks xmlns:a="http://schemas.openxmlformats.org/drawingml/2006/main" noChangeAspect="1"/>
             </wp:cNvGraphicFramePr>
@@ -18872,11 +18794,11 @@
               <a:graphicData uri="http://schemas.openxmlformats.org/drawingml/2006/picture">
                 <pic:pic xmlns:pic="http://schemas.openxmlformats.org/drawingml/2006/picture">
                   <pic:nvPicPr>
-                    <pic:cNvPr id="839023660" name=""/>
+                    <pic:cNvPr id="1690896393" name=""/>
                     <pic:cNvPicPr/>
                   </pic:nvPicPr>
                   <pic:blipFill>
-                    <a:blip r:embed="rId26">
+                    <a:blip r:embed="rId26" cstate="print">
                       <a:extLst>
                         <a:ext uri="{28A0092B-C50C-407E-A947-70E740481C1C}">
                           <a14:useLocalDpi xmlns:a14="http://schemas.microsoft.com/office/drawing/2010/main" val="0"/>
@@ -18890,7 +18812,7 @@
                   <pic:spPr>
                     <a:xfrm>
                       <a:off x="0" y="0"/>
-                      <a:ext cx="5822954" cy="3455036"/>
+                      <a:ext cx="5760085" cy="3797935"/>
                     </a:xfrm>
                     <a:prstGeom prst="rect">
                       <a:avLst/>
@@ -18899,22 +18821,9 @@
                 </pic:pic>
               </a:graphicData>
             </a:graphic>
-            <wp14:sizeRelH relativeFrom="margin">
-              <wp14:pctWidth>0</wp14:pctWidth>
-            </wp14:sizeRelH>
-            <wp14:sizeRelV relativeFrom="margin">
-              <wp14:pctHeight>0</wp14:pctHeight>
-            </wp14:sizeRelV>
           </wp:anchor>
         </w:drawing>
       </w:r>
-      <w:r>
-        <w:t>Liste des clients avec le paginator</w:t>
-      </w:r>
-      <w:bookmarkEnd w:id="19"/>
-      <w:r>
-        <w:t xml:space="preserve"> </w:t>
-      </w:r>
     </w:p>
     <w:p>
       <w:pPr>
@@ -19009,23 +18918,42 @@
         <w:rPr>
           <w:b/>
           <w:bCs/>
-          <w:noProof/>
-          <w:sz w:val="32"/>
-          <w:szCs w:val="32"/>
-        </w:rPr>
+          <w:sz w:val="32"/>
+          <w:szCs w:val="32"/>
+        </w:rPr>
+        <w:t>Show client</w:t>
+      </w:r>
+    </w:p>
+    <w:p>
+      <w:pPr>
+        <w:rPr>
+          <w:b/>
+          <w:bCs/>
+          <w:sz w:val="32"/>
+          <w:szCs w:val="32"/>
+        </w:rPr>
+      </w:pPr>
+      <w:r>
+        <w:rPr>
+          <w:b/>
+          <w:bCs/>
+          <w:sz w:val="32"/>
+          <w:szCs w:val="32"/>
+        </w:rPr>
+        <w:lastRenderedPageBreak/>
         <w:drawing>
-          <wp:anchor distT="0" distB="0" distL="114300" distR="114300" simplePos="0" relativeHeight="251707904" behindDoc="1" locked="0" layoutInCell="1" allowOverlap="1" wp14:anchorId="42745786" wp14:editId="5D7DF7DF">
+          <wp:anchor distT="0" distB="0" distL="114300" distR="114300" simplePos="0" relativeHeight="251733504" behindDoc="1" locked="0" layoutInCell="1" allowOverlap="1" wp14:anchorId="7EF7C5CA" wp14:editId="0881CB8D">
             <wp:simplePos x="0" y="0"/>
-            <wp:positionH relativeFrom="margin">
-              <wp:align>right</wp:align>
+            <wp:positionH relativeFrom="column">
+              <wp:posOffset>128270</wp:posOffset>
             </wp:positionH>
             <wp:positionV relativeFrom="paragraph">
-              <wp:posOffset>341721</wp:posOffset>
+              <wp:posOffset>15240</wp:posOffset>
             </wp:positionV>
-            <wp:extent cx="5759458" cy="3276600"/>
-            <wp:effectExtent l="0" t="0" r="0" b="0"/>
+            <wp:extent cx="5760085" cy="3768725"/>
+            <wp:effectExtent l="0" t="0" r="0" b="3175"/>
             <wp:wrapNone/>
-            <wp:docPr id="785712457" name="Image 1"/>
+            <wp:docPr id="153539002" name="Image 1"/>
             <wp:cNvGraphicFramePr>
               <a:graphicFrameLocks xmlns:a="http://schemas.openxmlformats.org/drawingml/2006/main" noChangeAspect="1"/>
             </wp:cNvGraphicFramePr>
@@ -19033,11 +18961,11 @@
               <a:graphicData uri="http://schemas.openxmlformats.org/drawingml/2006/picture">
                 <pic:pic xmlns:pic="http://schemas.openxmlformats.org/drawingml/2006/picture">
                   <pic:nvPicPr>
-                    <pic:cNvPr id="785712457" name=""/>
+                    <pic:cNvPr id="153539002" name=""/>
                     <pic:cNvPicPr/>
                   </pic:nvPicPr>
                   <pic:blipFill>
-                    <a:blip r:embed="rId27">
+                    <a:blip r:embed="rId27" cstate="print">
                       <a:extLst>
                         <a:ext uri="{28A0092B-C50C-407E-A947-70E740481C1C}">
                           <a14:useLocalDpi xmlns:a14="http://schemas.microsoft.com/office/drawing/2010/main" val="0"/>
@@ -19051,7 +18979,172 @@
                   <pic:spPr>
                     <a:xfrm>
                       <a:off x="0" y="0"/>
-                      <a:ext cx="5767940" cy="3281425"/>
+                      <a:ext cx="5760085" cy="3768725"/>
+                    </a:xfrm>
+                    <a:prstGeom prst="rect">
+                      <a:avLst/>
+                    </a:prstGeom>
+                  </pic:spPr>
+                </pic:pic>
+              </a:graphicData>
+            </a:graphic>
+          </wp:anchor>
+        </w:drawing>
+      </w:r>
+    </w:p>
+    <w:p>
+      <w:pPr>
+        <w:rPr>
+          <w:b/>
+          <w:bCs/>
+          <w:sz w:val="32"/>
+          <w:szCs w:val="32"/>
+        </w:rPr>
+      </w:pPr>
+    </w:p>
+    <w:p>
+      <w:pPr>
+        <w:rPr>
+          <w:b/>
+          <w:bCs/>
+          <w:sz w:val="32"/>
+          <w:szCs w:val="32"/>
+        </w:rPr>
+      </w:pPr>
+    </w:p>
+    <w:p>
+      <w:pPr>
+        <w:rPr>
+          <w:b/>
+          <w:bCs/>
+          <w:sz w:val="32"/>
+          <w:szCs w:val="32"/>
+        </w:rPr>
+      </w:pPr>
+    </w:p>
+    <w:p>
+      <w:pPr>
+        <w:rPr>
+          <w:b/>
+          <w:bCs/>
+          <w:sz w:val="32"/>
+          <w:szCs w:val="32"/>
+        </w:rPr>
+      </w:pPr>
+    </w:p>
+    <w:p>
+      <w:pPr>
+        <w:rPr>
+          <w:b/>
+          <w:bCs/>
+          <w:sz w:val="32"/>
+          <w:szCs w:val="32"/>
+        </w:rPr>
+      </w:pPr>
+    </w:p>
+    <w:p>
+      <w:pPr>
+        <w:rPr>
+          <w:b/>
+          <w:bCs/>
+          <w:sz w:val="32"/>
+          <w:szCs w:val="32"/>
+        </w:rPr>
+      </w:pPr>
+    </w:p>
+    <w:p>
+      <w:pPr>
+        <w:rPr>
+          <w:b/>
+          <w:bCs/>
+          <w:sz w:val="32"/>
+          <w:szCs w:val="32"/>
+        </w:rPr>
+      </w:pPr>
+    </w:p>
+    <w:p>
+      <w:pPr>
+        <w:rPr>
+          <w:b/>
+          <w:bCs/>
+          <w:sz w:val="32"/>
+          <w:szCs w:val="32"/>
+        </w:rPr>
+      </w:pPr>
+    </w:p>
+    <w:p>
+      <w:pPr>
+        <w:rPr>
+          <w:b/>
+          <w:bCs/>
+          <w:sz w:val="32"/>
+          <w:szCs w:val="32"/>
+        </w:rPr>
+      </w:pPr>
+    </w:p>
+    <w:p>
+      <w:pPr>
+        <w:pStyle w:val="Titre2"/>
+      </w:pPr>
+      <w:bookmarkStart w:id="20" w:name="_Toc228464231"/>
+      <w:r>
+        <w:t>Edit client</w:t>
+      </w:r>
+      <w:bookmarkEnd w:id="20"/>
+    </w:p>
+    <w:p>
+      <w:pPr>
+        <w:rPr>
+          <w:b/>
+          <w:bCs/>
+          <w:sz w:val="32"/>
+          <w:szCs w:val="32"/>
+        </w:rPr>
+      </w:pPr>
+      <w:r>
+        <w:rPr>
+          <w:sz w:val="32"/>
+          <w:szCs w:val="32"/>
+        </w:rPr>
+        <w:drawing>
+          <wp:anchor distT="0" distB="0" distL="114300" distR="114300" simplePos="0" relativeHeight="251734528" behindDoc="1" locked="0" layoutInCell="1" allowOverlap="1" wp14:anchorId="65B65FB2" wp14:editId="30FA9856">
+            <wp:simplePos x="0" y="0"/>
+            <wp:positionH relativeFrom="margin">
+              <wp:align>left</wp:align>
+            </wp:positionH>
+            <wp:positionV relativeFrom="paragraph">
+              <wp:posOffset>143510</wp:posOffset>
+            </wp:positionV>
+            <wp:extent cx="5760085" cy="4191000"/>
+            <wp:effectExtent l="0" t="0" r="0" b="0"/>
+            <wp:wrapNone/>
+            <wp:docPr id="28006610" name="Image 1"/>
+            <wp:cNvGraphicFramePr>
+              <a:graphicFrameLocks xmlns:a="http://schemas.openxmlformats.org/drawingml/2006/main" noChangeAspect="1"/>
+            </wp:cNvGraphicFramePr>
+            <a:graphic xmlns:a="http://schemas.openxmlformats.org/drawingml/2006/main">
+              <a:graphicData uri="http://schemas.openxmlformats.org/drawingml/2006/picture">
+                <pic:pic xmlns:pic="http://schemas.openxmlformats.org/drawingml/2006/picture">
+                  <pic:nvPicPr>
+                    <pic:cNvPr id="28006610" name=""/>
+                    <pic:cNvPicPr/>
+                  </pic:nvPicPr>
+                  <pic:blipFill>
+                    <a:blip r:embed="rId28">
+                      <a:extLst>
+                        <a:ext uri="{28A0092B-C50C-407E-A947-70E740481C1C}">
+                          <a14:useLocalDpi xmlns:a14="http://schemas.microsoft.com/office/drawing/2010/main" val="0"/>
+                        </a:ext>
+                      </a:extLst>
+                    </a:blip>
+                    <a:stretch>
+                      <a:fillRect/>
+                    </a:stretch>
+                  </pic:blipFill>
+                  <pic:spPr>
+                    <a:xfrm>
+                      <a:off x="0" y="0"/>
+                      <a:ext cx="5760085" cy="4191000"/>
                     </a:xfrm>
                     <a:prstGeom prst="rect">
                       <a:avLst/>
@@ -19066,193 +19159,142 @@
           </wp:anchor>
         </w:drawing>
       </w:r>
-      <w:r>
-        <w:rPr>
-          <w:b/>
-          <w:bCs/>
-          <w:sz w:val="32"/>
-          <w:szCs w:val="32"/>
-        </w:rPr>
-        <w:t>Show client</w:t>
-      </w:r>
-    </w:p>
-    <w:p>
-      <w:pPr>
-        <w:pStyle w:val="Titre2"/>
-      </w:pPr>
-      <w:bookmarkStart w:id="20" w:name="_Toc228464231"/>
-      <w:r>
-        <w:rPr>
-          <w:b/>
-          <w:bCs/>
+    </w:p>
+    <w:p>
+      <w:pPr>
+        <w:rPr>
+          <w:sz w:val="32"/>
+          <w:szCs w:val="32"/>
+        </w:rPr>
+      </w:pPr>
+    </w:p>
+    <w:p>
+      <w:pPr>
+        <w:rPr>
+          <w:sz w:val="32"/>
+          <w:szCs w:val="32"/>
+        </w:rPr>
+      </w:pPr>
+    </w:p>
+    <w:p>
+      <w:pPr>
+        <w:rPr>
+          <w:sz w:val="32"/>
+          <w:szCs w:val="32"/>
+        </w:rPr>
+      </w:pPr>
+    </w:p>
+    <w:p>
+      <w:pPr>
+        <w:rPr>
+          <w:sz w:val="32"/>
+          <w:szCs w:val="32"/>
+        </w:rPr>
+      </w:pPr>
+    </w:p>
+    <w:p>
+      <w:pPr>
+        <w:rPr>
+          <w:sz w:val="32"/>
+          <w:szCs w:val="32"/>
+        </w:rPr>
+      </w:pPr>
+    </w:p>
+    <w:p>
+      <w:pPr>
+        <w:rPr>
+          <w:sz w:val="32"/>
+          <w:szCs w:val="32"/>
+        </w:rPr>
+      </w:pPr>
+    </w:p>
+    <w:p>
+      <w:pPr>
+        <w:rPr>
+          <w:sz w:val="32"/>
+          <w:szCs w:val="32"/>
+        </w:rPr>
+      </w:pPr>
+    </w:p>
+    <w:p>
+      <w:pPr>
+        <w:rPr>
+          <w:sz w:val="32"/>
+          <w:szCs w:val="32"/>
+        </w:rPr>
+      </w:pPr>
+    </w:p>
+    <w:p>
+      <w:pPr>
+        <w:rPr>
+          <w:sz w:val="32"/>
+          <w:szCs w:val="32"/>
+        </w:rPr>
+      </w:pPr>
+    </w:p>
+    <w:p>
+      <w:pPr>
+        <w:rPr>
+          <w:sz w:val="32"/>
+          <w:szCs w:val="32"/>
+        </w:rPr>
+      </w:pPr>
+    </w:p>
+    <w:p>
+      <w:pPr>
+        <w:rPr>
+          <w:sz w:val="32"/>
+          <w:szCs w:val="32"/>
+        </w:rPr>
+      </w:pPr>
+    </w:p>
+    <w:p>
+      <w:pPr>
+        <w:rPr>
+          <w:sz w:val="32"/>
+          <w:szCs w:val="32"/>
+        </w:rPr>
+      </w:pPr>
+    </w:p>
+    <w:p>
+      <w:pPr>
+        <w:rPr>
+          <w:sz w:val="32"/>
+          <w:szCs w:val="32"/>
+        </w:rPr>
+      </w:pPr>
+    </w:p>
+    <w:p>
+      <w:pPr>
+        <w:rPr>
+          <w:sz w:val="32"/>
+          <w:szCs w:val="32"/>
+        </w:rPr>
+      </w:pPr>
+      <w:r>
+        <w:rPr>
+          <w:sz w:val="32"/>
+          <w:szCs w:val="32"/>
+        </w:rPr>
+        <w:lastRenderedPageBreak/>
+        <w:t>Si la modification est validée, un modal de confirmation s’ouvre</w:t>
+      </w:r>
+    </w:p>
+    <w:p>
+      <w:pPr>
+        <w:rPr>
+          <w:sz w:val="32"/>
+          <w:szCs w:val="32"/>
+        </w:rPr>
+      </w:pPr>
+      <w:r>
+        <w:rPr>
           <w:noProof/>
-        </w:rPr>
-        <w:lastRenderedPageBreak/>
+          <w:sz w:val="32"/>
+          <w:szCs w:val="32"/>
+        </w:rPr>
         <w:drawing>
-          <wp:anchor distT="0" distB="0" distL="114300" distR="114300" simplePos="0" relativeHeight="251708928" behindDoc="1" locked="0" layoutInCell="1" allowOverlap="1" wp14:anchorId="071B471F" wp14:editId="2E923D27">
-            <wp:simplePos x="0" y="0"/>
-            <wp:positionH relativeFrom="margin">
-              <wp:align>left</wp:align>
-            </wp:positionH>
-            <wp:positionV relativeFrom="paragraph">
-              <wp:posOffset>338999</wp:posOffset>
-            </wp:positionV>
-            <wp:extent cx="6239739" cy="3733800"/>
-            <wp:effectExtent l="0" t="0" r="8890" b="0"/>
-            <wp:wrapNone/>
-            <wp:docPr id="1586554293" name="Image 1"/>
-            <wp:cNvGraphicFramePr>
-              <a:graphicFrameLocks xmlns:a="http://schemas.openxmlformats.org/drawingml/2006/main" noChangeAspect="1"/>
-            </wp:cNvGraphicFramePr>
-            <a:graphic xmlns:a="http://schemas.openxmlformats.org/drawingml/2006/main">
-              <a:graphicData uri="http://schemas.openxmlformats.org/drawingml/2006/picture">
-                <pic:pic xmlns:pic="http://schemas.openxmlformats.org/drawingml/2006/picture">
-                  <pic:nvPicPr>
-                    <pic:cNvPr id="1586554293" name=""/>
-                    <pic:cNvPicPr/>
-                  </pic:nvPicPr>
-                  <pic:blipFill>
-                    <a:blip r:embed="rId28" cstate="print">
-                      <a:extLst>
-                        <a:ext uri="{28A0092B-C50C-407E-A947-70E740481C1C}">
-                          <a14:useLocalDpi xmlns:a14="http://schemas.microsoft.com/office/drawing/2010/main" val="0"/>
-                        </a:ext>
-                      </a:extLst>
-                    </a:blip>
-                    <a:stretch>
-                      <a:fillRect/>
-                    </a:stretch>
-                  </pic:blipFill>
-                  <pic:spPr>
-                    <a:xfrm>
-                      <a:off x="0" y="0"/>
-                      <a:ext cx="6251879" cy="3741065"/>
-                    </a:xfrm>
-                    <a:prstGeom prst="rect">
-                      <a:avLst/>
-                    </a:prstGeom>
-                  </pic:spPr>
-                </pic:pic>
-              </a:graphicData>
-            </a:graphic>
-            <wp14:sizeRelH relativeFrom="margin">
-              <wp14:pctWidth>0</wp14:pctWidth>
-            </wp14:sizeRelH>
-            <wp14:sizeRelV relativeFrom="margin">
-              <wp14:pctHeight>0</wp14:pctHeight>
-            </wp14:sizeRelV>
-          </wp:anchor>
-        </w:drawing>
-      </w:r>
-      <w:r>
-        <w:t>Edit client</w:t>
-      </w:r>
-      <w:bookmarkEnd w:id="20"/>
-    </w:p>
-    <w:p>
-      <w:pPr>
-        <w:rPr>
-          <w:b/>
-          <w:bCs/>
-          <w:sz w:val="32"/>
-          <w:szCs w:val="32"/>
-        </w:rPr>
-      </w:pPr>
-    </w:p>
-    <w:p>
-      <w:pPr>
-        <w:rPr>
-          <w:sz w:val="32"/>
-          <w:szCs w:val="32"/>
-        </w:rPr>
-      </w:pPr>
-    </w:p>
-    <w:p>
-      <w:pPr>
-        <w:rPr>
-          <w:sz w:val="32"/>
-          <w:szCs w:val="32"/>
-        </w:rPr>
-      </w:pPr>
-    </w:p>
-    <w:p>
-      <w:pPr>
-        <w:rPr>
-          <w:sz w:val="32"/>
-          <w:szCs w:val="32"/>
-        </w:rPr>
-      </w:pPr>
-    </w:p>
-    <w:p>
-      <w:pPr>
-        <w:rPr>
-          <w:sz w:val="32"/>
-          <w:szCs w:val="32"/>
-        </w:rPr>
-      </w:pPr>
-    </w:p>
-    <w:p>
-      <w:pPr>
-        <w:rPr>
-          <w:sz w:val="32"/>
-          <w:szCs w:val="32"/>
-        </w:rPr>
-      </w:pPr>
-    </w:p>
-    <w:p>
-      <w:pPr>
-        <w:rPr>
-          <w:sz w:val="32"/>
-          <w:szCs w:val="32"/>
-        </w:rPr>
-      </w:pPr>
-    </w:p>
-    <w:p>
-      <w:pPr>
-        <w:rPr>
-          <w:sz w:val="32"/>
-          <w:szCs w:val="32"/>
-        </w:rPr>
-      </w:pPr>
-    </w:p>
-    <w:p>
-      <w:pPr>
-        <w:rPr>
-          <w:sz w:val="32"/>
-          <w:szCs w:val="32"/>
-        </w:rPr>
-      </w:pPr>
-    </w:p>
-    <w:p>
-      <w:pPr>
-        <w:rPr>
-          <w:sz w:val="32"/>
-          <w:szCs w:val="32"/>
-        </w:rPr>
-      </w:pPr>
-      <w:r>
-        <w:rPr>
-          <w:sz w:val="32"/>
-          <w:szCs w:val="32"/>
-        </w:rPr>
-        <w:t>Si la modification est validée, un modal de confirmation s’ouvre</w:t>
-      </w:r>
-    </w:p>
-    <w:p>
-      <w:pPr>
-        <w:rPr>
-          <w:sz w:val="32"/>
-          <w:szCs w:val="32"/>
-        </w:rPr>
-      </w:pPr>
-      <w:r>
-        <w:rPr>
-          <w:noProof/>
-          <w:sz w:val="32"/>
-          <w:szCs w:val="32"/>
-        </w:rPr>
-        <w:drawing>
-          <wp:anchor distT="0" distB="0" distL="114300" distR="114300" simplePos="0" relativeHeight="251709952" behindDoc="1" locked="0" layoutInCell="1" allowOverlap="1" wp14:anchorId="21FD4D45" wp14:editId="78CA96C6">
+          <wp:anchor distT="0" distB="0" distL="114300" distR="114300" simplePos="0" relativeHeight="251709952" behindDoc="1" locked="0" layoutInCell="1" allowOverlap="1" wp14:anchorId="21FD4D45" wp14:editId="711A515C">
             <wp:simplePos x="0" y="0"/>
             <wp:positionH relativeFrom="column">
               <wp:posOffset>351426</wp:posOffset>
@@ -19396,59 +19438,10 @@
     </w:p>
     <w:p>
       <w:pPr>
-        <w:rPr>
-          <w:sz w:val="32"/>
-          <w:szCs w:val="32"/>
-        </w:rPr>
-      </w:pPr>
-    </w:p>
-    <w:p>
-      <w:pPr>
-        <w:rPr>
-          <w:sz w:val="32"/>
-          <w:szCs w:val="32"/>
-        </w:rPr>
-      </w:pPr>
-    </w:p>
-    <w:p>
-      <w:pPr>
-        <w:rPr>
-          <w:sz w:val="32"/>
-          <w:szCs w:val="32"/>
-        </w:rPr>
-      </w:pPr>
-    </w:p>
-    <w:p>
-      <w:pPr>
-        <w:rPr>
-          <w:sz w:val="32"/>
-          <w:szCs w:val="32"/>
-        </w:rPr>
-      </w:pPr>
-    </w:p>
-    <w:p>
-      <w:pPr>
-        <w:rPr>
-          <w:sz w:val="32"/>
-          <w:szCs w:val="32"/>
-        </w:rPr>
-      </w:pPr>
-    </w:p>
-    <w:p>
-      <w:pPr>
-        <w:rPr>
-          <w:sz w:val="32"/>
-          <w:szCs w:val="32"/>
-        </w:rPr>
-      </w:pPr>
-    </w:p>
-    <w:p>
-      <w:pPr>
         <w:pStyle w:val="Titre2"/>
       </w:pPr>
       <w:bookmarkStart w:id="21" w:name="_Toc228464232"/>
       <w:r>
-        <w:lastRenderedPageBreak/>
         <w:t>Le bouton suppression</w:t>
       </w:r>
       <w:bookmarkEnd w:id="21"/>
@@ -19732,80 +19725,6 @@
     </w:p>
     <w:p>
       <w:pPr>
-        <w:rPr>
-          <w:sz w:val="32"/>
-          <w:szCs w:val="32"/>
-        </w:rPr>
-      </w:pPr>
-    </w:p>
-    <w:p>
-      <w:pPr>
-        <w:rPr>
-          <w:sz w:val="32"/>
-          <w:szCs w:val="32"/>
-        </w:rPr>
-      </w:pPr>
-    </w:p>
-    <w:p>
-      <w:pPr>
-        <w:rPr>
-          <w:sz w:val="32"/>
-          <w:szCs w:val="32"/>
-        </w:rPr>
-      </w:pPr>
-    </w:p>
-    <w:p>
-      <w:pPr>
-        <w:rPr>
-          <w:sz w:val="32"/>
-          <w:szCs w:val="32"/>
-        </w:rPr>
-      </w:pPr>
-    </w:p>
-    <w:p>
-      <w:pPr>
-        <w:rPr>
-          <w:sz w:val="32"/>
-          <w:szCs w:val="32"/>
-        </w:rPr>
-      </w:pPr>
-    </w:p>
-    <w:p>
-      <w:pPr>
-        <w:rPr>
-          <w:sz w:val="32"/>
-          <w:szCs w:val="32"/>
-        </w:rPr>
-      </w:pPr>
-    </w:p>
-    <w:p>
-      <w:pPr>
-        <w:rPr>
-          <w:sz w:val="32"/>
-          <w:szCs w:val="32"/>
-        </w:rPr>
-      </w:pPr>
-    </w:p>
-    <w:p>
-      <w:pPr>
-        <w:rPr>
-          <w:sz w:val="40"/>
-          <w:szCs w:val="40"/>
-          <w:bdr w:val="single" w:sz="4" w:space="0" w:color="auto"/>
-        </w:rPr>
-      </w:pPr>
-    </w:p>
-    <w:p>
-      <w:pPr>
-        <w:rPr>
-          <w:sz w:val="40"/>
-          <w:szCs w:val="40"/>
-          <w:bdr w:val="single" w:sz="4" w:space="0" w:color="auto"/>
-        </w:rPr>
-      </w:pPr>
-    </w:p>
-    <w:p>
-      <w:pPr>
         <w:pStyle w:val="Titre1"/>
       </w:pPr>
       <w:bookmarkStart w:id="22" w:name="_Toc228464233"/>
@@ -19827,23 +19746,22 @@
       </w:pPr>
       <w:r>
         <w:rPr>
-          <w:noProof/>
           <w:sz w:val="32"/>
           <w:szCs w:val="32"/>
         </w:rPr>
         <w:drawing>
-          <wp:anchor distT="0" distB="0" distL="114300" distR="114300" simplePos="0" relativeHeight="251678208" behindDoc="1" locked="0" layoutInCell="1" allowOverlap="1" wp14:anchorId="03ABAF07" wp14:editId="1C823755">
+          <wp:anchor distT="0" distB="0" distL="114300" distR="114300" simplePos="0" relativeHeight="251735552" behindDoc="1" locked="0" layoutInCell="1" allowOverlap="1" wp14:anchorId="3D2114D4" wp14:editId="5D16989E">
             <wp:simplePos x="0" y="0"/>
             <wp:positionH relativeFrom="margin">
-              <wp:align>right</wp:align>
+              <wp:align>left</wp:align>
             </wp:positionH>
             <wp:positionV relativeFrom="paragraph">
-              <wp:posOffset>15240</wp:posOffset>
+              <wp:posOffset>151130</wp:posOffset>
             </wp:positionV>
-            <wp:extent cx="5761990" cy="4143375"/>
-            <wp:effectExtent l="0" t="0" r="0" b="9525"/>
+            <wp:extent cx="5760085" cy="3778250"/>
+            <wp:effectExtent l="0" t="0" r="0" b="0"/>
             <wp:wrapNone/>
-            <wp:docPr id="264670344" name="Image 6"/>
+            <wp:docPr id="102196560" name="Image 1"/>
             <wp:cNvGraphicFramePr>
               <a:graphicFrameLocks xmlns:a="http://schemas.openxmlformats.org/drawingml/2006/main" noChangeAspect="1"/>
             </wp:cNvGraphicFramePr>
@@ -19851,43 +19769,33 @@
               <a:graphicData uri="http://schemas.openxmlformats.org/drawingml/2006/picture">
                 <pic:pic xmlns:pic="http://schemas.openxmlformats.org/drawingml/2006/picture">
                   <pic:nvPicPr>
-                    <pic:cNvPr id="0" name="Picture 2"/>
-                    <pic:cNvPicPr>
-                      <a:picLocks noChangeAspect="1" noChangeArrowheads="1"/>
-                    </pic:cNvPicPr>
+                    <pic:cNvPr id="102196560" name=""/>
+                    <pic:cNvPicPr/>
                   </pic:nvPicPr>
                   <pic:blipFill>
-                    <a:blip r:embed="rId31">
+                    <a:blip r:embed="rId31" cstate="print">
                       <a:extLst>
                         <a:ext uri="{28A0092B-C50C-407E-A947-70E740481C1C}">
                           <a14:useLocalDpi xmlns:a14="http://schemas.microsoft.com/office/drawing/2010/main" val="0"/>
                         </a:ext>
                       </a:extLst>
                     </a:blip>
-                    <a:srcRect/>
                     <a:stretch>
                       <a:fillRect/>
                     </a:stretch>
                   </pic:blipFill>
-                  <pic:spPr bwMode="auto">
+                  <pic:spPr>
                     <a:xfrm>
                       <a:off x="0" y="0"/>
-                      <a:ext cx="5761990" cy="4143375"/>
+                      <a:ext cx="5760085" cy="3778250"/>
                     </a:xfrm>
                     <a:prstGeom prst="rect">
                       <a:avLst/>
                     </a:prstGeom>
-                    <a:noFill/>
-                    <a:ln>
-                      <a:noFill/>
-                    </a:ln>
                   </pic:spPr>
                 </pic:pic>
               </a:graphicData>
             </a:graphic>
-            <wp14:sizeRelV relativeFrom="margin">
-              <wp14:pctHeight>0</wp14:pctHeight>
-            </wp14:sizeRelV>
           </wp:anchor>
         </w:drawing>
       </w:r>
@@ -19968,24 +19876,20 @@
       <w:pPr>
         <w:pStyle w:val="Titre2"/>
       </w:pPr>
-      <w:bookmarkStart w:id="23" w:name="_Toc228464234"/>
-      <w:r>
-        <w:rPr>
-          <w:noProof/>
-        </w:rPr>
+      <w:r>
         <w:drawing>
-          <wp:anchor distT="0" distB="0" distL="114300" distR="114300" simplePos="0" relativeHeight="251694592" behindDoc="1" locked="0" layoutInCell="1" allowOverlap="1" wp14:anchorId="0BB72E0B" wp14:editId="65128CE5">
+          <wp:anchor distT="0" distB="0" distL="114300" distR="114300" simplePos="0" relativeHeight="251736576" behindDoc="1" locked="0" layoutInCell="1" allowOverlap="1" wp14:anchorId="005FE41A" wp14:editId="5E32C759">
             <wp:simplePos x="0" y="0"/>
-            <wp:positionH relativeFrom="margin">
+            <wp:positionH relativeFrom="page">
               <wp:align>left</wp:align>
             </wp:positionH>
             <wp:positionV relativeFrom="paragraph">
-              <wp:posOffset>7620</wp:posOffset>
+              <wp:posOffset>380365</wp:posOffset>
             </wp:positionV>
-            <wp:extent cx="5760085" cy="648970"/>
+            <wp:extent cx="6725285" cy="1168400"/>
             <wp:effectExtent l="0" t="0" r="0" b="0"/>
             <wp:wrapNone/>
-            <wp:docPr id="9777456" name="Image 7"/>
+            <wp:docPr id="827132820" name="Image 1"/>
             <wp:cNvGraphicFramePr>
               <a:graphicFrameLocks xmlns:a="http://schemas.openxmlformats.org/drawingml/2006/main" noChangeAspect="1"/>
             </wp:cNvGraphicFramePr>
@@ -19993,7 +19897,7 @@
               <a:graphicData uri="http://schemas.openxmlformats.org/drawingml/2006/picture">
                 <pic:pic xmlns:pic="http://schemas.openxmlformats.org/drawingml/2006/picture">
                   <pic:nvPicPr>
-                    <pic:cNvPr id="9777456" name="Image 9777456"/>
+                    <pic:cNvPr id="827132820" name=""/>
                     <pic:cNvPicPr/>
                   </pic:nvPicPr>
                   <pic:blipFill>
@@ -20011,7 +19915,7 @@
                   <pic:spPr>
                     <a:xfrm>
                       <a:off x="0" y="0"/>
-                      <a:ext cx="5760085" cy="648970"/>
+                      <a:ext cx="6725285" cy="1168400"/>
                     </a:xfrm>
                     <a:prstGeom prst="rect">
                       <a:avLst/>
@@ -20023,9 +19927,22 @@
           </wp:anchor>
         </w:drawing>
       </w:r>
-      <w:bookmarkEnd w:id="23"/>
+    </w:p>
+    <w:p>
+      <w:pPr>
+        <w:pStyle w:val="Titre2"/>
+      </w:pPr>
     </w:p>
     <w:p/>
+    <w:p>
+      <w:pPr>
+        <w:ind w:firstLine="567"/>
+        <w:rPr>
+          <w:b/>
+          <w:bCs/>
+        </w:rPr>
+      </w:pPr>
+    </w:p>
     <w:p>
       <w:pPr>
         <w:ind w:firstLine="567"/>
@@ -20219,12 +20136,12 @@
       <w:pPr>
         <w:pStyle w:val="Titre1"/>
       </w:pPr>
-      <w:bookmarkStart w:id="24" w:name="_Toc228464235"/>
+      <w:bookmarkStart w:id="23" w:name="_Toc228464235"/>
       <w:r>
         <w:lastRenderedPageBreak/>
         <w:t>Fonctionnement du bouton suppression</w:t>
       </w:r>
-      <w:bookmarkEnd w:id="24"/>
+      <w:bookmarkEnd w:id="23"/>
     </w:p>
     <w:p>
       <w:pPr>
@@ -21286,12 +21203,12 @@
         <w:pStyle w:val="Titre1"/>
         <w:spacing w:after="0" w:line="240" w:lineRule="auto"/>
       </w:pPr>
-      <w:bookmarkStart w:id="25" w:name="_Toc228464236"/>
+      <w:bookmarkStart w:id="24" w:name="_Toc228464236"/>
       <w:r>
         <w:lastRenderedPageBreak/>
         <w:t>Gestion du catalogue produit</w:t>
       </w:r>
-      <w:bookmarkEnd w:id="25"/>
+      <w:bookmarkEnd w:id="24"/>
     </w:p>
     <w:p>
       <w:pPr>
@@ -21799,12 +21716,12 @@
       <w:pPr>
         <w:pStyle w:val="Titre2"/>
       </w:pPr>
-      <w:bookmarkStart w:id="26" w:name="_Toc228464237"/>
+      <w:bookmarkStart w:id="25" w:name="_Toc228464237"/>
       <w:r>
         <w:lastRenderedPageBreak/>
         <w:t>Pagination</w:t>
       </w:r>
-      <w:bookmarkEnd w:id="26"/>
+      <w:bookmarkEnd w:id="25"/>
     </w:p>
     <w:p>
       <w:pPr>
@@ -22008,12 +21925,12 @@
       <w:pPr>
         <w:pStyle w:val="Titre1"/>
       </w:pPr>
-      <w:bookmarkStart w:id="27" w:name="_Toc228464238"/>
+      <w:bookmarkStart w:id="26" w:name="_Toc228464238"/>
       <w:r>
         <w:lastRenderedPageBreak/>
         <w:t>Calcul des montants (TVA et total des factures)</w:t>
       </w:r>
-      <w:bookmarkEnd w:id="27"/>
+      <w:bookmarkEnd w:id="26"/>
     </w:p>
     <w:p>
       <w:pPr>
@@ -22764,14 +22681,14 @@
       <w:pPr>
         <w:pStyle w:val="Titre2"/>
       </w:pPr>
-      <w:bookmarkStart w:id="28" w:name="_Toc228464239"/>
+      <w:bookmarkStart w:id="27" w:name="_Toc228464239"/>
       <w:r>
         <w:t>Formules de calcul des p</w:t>
       </w:r>
       <w:r>
         <w:t>rix</w:t>
       </w:r>
-      <w:bookmarkEnd w:id="28"/>
+      <w:bookmarkEnd w:id="27"/>
     </w:p>
     <w:p>
       <w:pPr>
@@ -23528,12 +23445,12 @@
       <w:pPr>
         <w:pStyle w:val="Titre1"/>
       </w:pPr>
-      <w:bookmarkStart w:id="29" w:name="_Toc228464240"/>
+      <w:bookmarkStart w:id="28" w:name="_Toc228464240"/>
       <w:r>
         <w:lastRenderedPageBreak/>
         <w:t>Fonctionnement des controllers</w:t>
       </w:r>
-      <w:bookmarkEnd w:id="29"/>
+      <w:bookmarkEnd w:id="28"/>
     </w:p>
     <w:p>
       <w:pPr>
@@ -24003,11 +23920,11 @@
       <w:pPr>
         <w:pStyle w:val="Titre2"/>
       </w:pPr>
-      <w:bookmarkStart w:id="30" w:name="_Toc228464241"/>
+      <w:bookmarkStart w:id="29" w:name="_Toc228464241"/>
       <w:r>
         <w:t>Recherche et filtrage des produits</w:t>
       </w:r>
-      <w:bookmarkEnd w:id="30"/>
+      <w:bookmarkEnd w:id="29"/>
     </w:p>
     <w:p>
       <w:pPr>
@@ -25004,12 +24921,12 @@
       <w:pPr>
         <w:pStyle w:val="Titre1"/>
       </w:pPr>
-      <w:bookmarkStart w:id="31" w:name="_Toc228464242"/>
+      <w:bookmarkStart w:id="30" w:name="_Toc228464242"/>
       <w:r>
         <w:lastRenderedPageBreak/>
         <w:t>Génération d’un PDF de la facture</w:t>
       </w:r>
-      <w:bookmarkEnd w:id="31"/>
+      <w:bookmarkEnd w:id="30"/>
     </w:p>
     <w:p>
       <w:pPr>
@@ -25221,11 +25138,11 @@
       <w:pPr>
         <w:pStyle w:val="Titre2"/>
       </w:pPr>
-      <w:bookmarkStart w:id="32" w:name="_Toc228464243"/>
+      <w:bookmarkStart w:id="31" w:name="_Toc228464243"/>
       <w:r>
         <w:t>Mise en place de Gotenberg</w:t>
       </w:r>
-      <w:bookmarkEnd w:id="32"/>
+      <w:bookmarkEnd w:id="31"/>
     </w:p>
     <w:p>
       <w:pPr>
@@ -25658,12 +25575,12 @@
       <w:pPr>
         <w:pStyle w:val="Titre2"/>
       </w:pPr>
-      <w:bookmarkStart w:id="33" w:name="_Toc228464244"/>
+      <w:bookmarkStart w:id="32" w:name="_Toc228464244"/>
       <w:r>
         <w:lastRenderedPageBreak/>
         <w:t>Fonctionnement</w:t>
       </w:r>
-      <w:bookmarkEnd w:id="33"/>
+      <w:bookmarkEnd w:id="32"/>
     </w:p>
     <w:p>
       <w:pPr>
@@ -25833,11 +25750,11 @@
       <w:pPr>
         <w:pStyle w:val="Titre1"/>
       </w:pPr>
-      <w:bookmarkStart w:id="34" w:name="_Toc228464245"/>
+      <w:bookmarkStart w:id="33" w:name="_Toc228464245"/>
       <w:r>
         <w:t>Docker, WSL et conteneurs</w:t>
       </w:r>
-      <w:bookmarkEnd w:id="34"/>
+      <w:bookmarkEnd w:id="33"/>
     </w:p>
     <w:p>
       <w:pPr>
@@ -26143,7 +26060,7 @@
       <w:pPr>
         <w:pStyle w:val="Titre1"/>
       </w:pPr>
-      <w:bookmarkStart w:id="35" w:name="_Toc228464246"/>
+      <w:bookmarkStart w:id="34" w:name="_Toc228464246"/>
       <w:r>
         <w:t xml:space="preserve">Envoi </w:t>
       </w:r>
@@ -26155,7 +26072,7 @@
       <w:r>
         <w:t xml:space="preserve"> et utilisation de Mailpit</w:t>
       </w:r>
-      <w:bookmarkEnd w:id="35"/>
+      <w:bookmarkEnd w:id="34"/>
     </w:p>
     <w:p>
       <w:pPr>
@@ -26404,11 +26321,11 @@
       <w:pPr>
         <w:pStyle w:val="Titre2"/>
       </w:pPr>
-      <w:bookmarkStart w:id="36" w:name="_Toc228464247"/>
+      <w:bookmarkStart w:id="35" w:name="_Toc228464247"/>
       <w:r>
         <w:t>Mise en place de Mailpit</w:t>
       </w:r>
-      <w:bookmarkEnd w:id="36"/>
+      <w:bookmarkEnd w:id="35"/>
     </w:p>
     <w:p>
       <w:pPr>
@@ -27134,7 +27051,7 @@
           <w:szCs w:val="40"/>
         </w:rPr>
         <w:drawing>
-          <wp:anchor distT="0" distB="0" distL="114300" distR="114300" simplePos="0" relativeHeight="251715072" behindDoc="1" locked="0" layoutInCell="1" allowOverlap="1" wp14:anchorId="53BF247B" wp14:editId="1EAB79C7">
+          <wp:anchor distT="0" distB="0" distL="114300" distR="114300" simplePos="0" relativeHeight="251715072" behindDoc="1" locked="0" layoutInCell="1" allowOverlap="1" wp14:anchorId="53BF247B" wp14:editId="6632617C">
             <wp:simplePos x="0" y="0"/>
             <wp:positionH relativeFrom="page">
               <wp:posOffset>1272812</wp:posOffset>
@@ -27467,7 +27384,7 @@
           <w:szCs w:val="40"/>
         </w:rPr>
         <w:drawing>
-          <wp:anchor distT="0" distB="0" distL="114300" distR="114300" simplePos="0" relativeHeight="251718144" behindDoc="1" locked="0" layoutInCell="1" allowOverlap="1" wp14:anchorId="534CC592" wp14:editId="3C40D801">
+          <wp:anchor distT="0" distB="0" distL="114300" distR="114300" simplePos="0" relativeHeight="251718144" behindDoc="1" locked="0" layoutInCell="1" allowOverlap="1" wp14:anchorId="534CC592" wp14:editId="46DB4D54">
             <wp:simplePos x="0" y="0"/>
             <wp:positionH relativeFrom="margin">
               <wp:posOffset>-486773</wp:posOffset>
@@ -27573,7 +27490,7 @@
           <w:szCs w:val="40"/>
         </w:rPr>
         <w:drawing>
-          <wp:anchor distT="0" distB="0" distL="114300" distR="114300" simplePos="0" relativeHeight="251719168" behindDoc="1" locked="0" layoutInCell="1" allowOverlap="1" wp14:anchorId="42BD067D" wp14:editId="0562D98E">
+          <wp:anchor distT="0" distB="0" distL="114300" distR="114300" simplePos="0" relativeHeight="251719168" behindDoc="1" locked="0" layoutInCell="1" allowOverlap="1" wp14:anchorId="42BD067D" wp14:editId="3ACC335D">
             <wp:simplePos x="0" y="0"/>
             <wp:positionH relativeFrom="margin">
               <wp:align>left</wp:align>
@@ -27736,12 +27653,12 @@
       <w:pPr>
         <w:pStyle w:val="Titre1"/>
       </w:pPr>
-      <w:bookmarkStart w:id="37" w:name="_Toc228464248"/>
+      <w:bookmarkStart w:id="36" w:name="_Toc228464248"/>
       <w:r>
         <w:lastRenderedPageBreak/>
         <w:t>Le Launcher</w:t>
       </w:r>
-      <w:bookmarkEnd w:id="37"/>
+      <w:bookmarkEnd w:id="36"/>
     </w:p>
     <w:p>
       <w:pPr>
@@ -27906,7 +27823,7 @@
       <w:pPr>
         <w:pStyle w:val="Titre2"/>
       </w:pPr>
-      <w:bookmarkStart w:id="38" w:name="_Toc228464249"/>
+      <w:bookmarkStart w:id="37" w:name="_Toc228464249"/>
       <w:r>
         <w:rPr>
           <w:rFonts w:ascii="Segoe UI Emoji" w:hAnsi="Segoe UI Emoji" w:cs="Segoe UI Emoji"/>
@@ -27916,7 +27833,7 @@
       <w:r>
         <w:t xml:space="preserve"> Évolution vers un exécutable (.exe)</w:t>
       </w:r>
-      <w:bookmarkEnd w:id="38"/>
+      <w:bookmarkEnd w:id="37"/>
     </w:p>
     <w:p>
       <w:pPr>
@@ -28229,7 +28146,7 @@
       <w:pPr>
         <w:pStyle w:val="Titre2"/>
       </w:pPr>
-      <w:bookmarkStart w:id="39" w:name="_Toc228464250"/>
+      <w:bookmarkStart w:id="38" w:name="_Toc228464250"/>
       <w:r>
         <w:rPr>
           <w:rFonts w:ascii="Segoe UI Emoji" w:hAnsi="Segoe UI Emoji" w:cs="Segoe UI Emoji"/>
@@ -28239,7 +28156,7 @@
       <w:r>
         <w:t xml:space="preserve"> Fonctionnalités du launcher</w:t>
       </w:r>
-      <w:bookmarkEnd w:id="39"/>
+      <w:bookmarkEnd w:id="38"/>
     </w:p>
     <w:p>
       <w:pPr>
@@ -28581,7 +28498,7 @@
         <w:pStyle w:val="Titre2"/>
         <w:spacing w:line="240" w:lineRule="auto"/>
       </w:pPr>
-      <w:bookmarkStart w:id="40" w:name="_Toc228464251"/>
+      <w:bookmarkStart w:id="39" w:name="_Toc228464251"/>
       <w:r>
         <w:rPr>
           <w:rFonts w:ascii="Segoe UI Emoji" w:hAnsi="Segoe UI Emoji" w:cs="Segoe UI Emoji"/>
@@ -28592,7 +28509,7 @@
       <w:r>
         <w:t xml:space="preserve"> Objectif</w:t>
       </w:r>
-      <w:bookmarkEnd w:id="40"/>
+      <w:bookmarkEnd w:id="39"/>
     </w:p>
     <w:p>
       <w:pPr>
@@ -29491,12 +29408,12 @@
       <w:pPr>
         <w:pStyle w:val="Titre1"/>
       </w:pPr>
-      <w:bookmarkStart w:id="41" w:name="_Toc228464252"/>
+      <w:bookmarkStart w:id="40" w:name="_Toc228464252"/>
       <w:r>
         <w:lastRenderedPageBreak/>
         <w:t>Conclusion</w:t>
       </w:r>
-      <w:bookmarkEnd w:id="41"/>
+      <w:bookmarkEnd w:id="40"/>
     </w:p>
     <w:p>
       <w:pPr>
@@ -29737,12 +29654,12 @@
       <w:pPr>
         <w:pStyle w:val="Titre1"/>
       </w:pPr>
-      <w:bookmarkStart w:id="42" w:name="_Toc228464253"/>
+      <w:bookmarkStart w:id="41" w:name="_Toc228464253"/>
       <w:r>
         <w:lastRenderedPageBreak/>
         <w:t>Glossaire technique</w:t>
       </w:r>
-      <w:bookmarkEnd w:id="42"/>
+      <w:bookmarkEnd w:id="41"/>
     </w:p>
     <w:p>
       <w:pPr>
@@ -35148,6 +35065,7 @@
   <w:style w:type="character" w:default="1" w:styleId="Policepardfaut">
     <w:name w:val="Default Paragraph Font"/>
     <w:uiPriority w:val="1"/>
+    <w:semiHidden/>
     <w:unhideWhenUsed/>
   </w:style>
   <w:style w:type="table" w:default="1" w:styleId="TableauNormal">

</xml_diff>